<commit_message>
deploy(railway): copy full context before install to fix partial deps
</commit_message>
<xml_diff>
--- a/docs/word files/vocabs.docx
+++ b/docs/word files/vocabs.docx
@@ -2,6 +2,46 @@
 <file path=word/document.xml><?xml version="1.0" encoding="utf-8"?>
 <w:document xmlns:wpc="http://schemas.microsoft.com/office/word/2010/wordprocessingCanvas" xmlns:cx="http://schemas.microsoft.com/office/drawing/2014/chartex" xmlns:cx1="http://schemas.microsoft.com/office/drawing/2015/9/8/chartex" xmlns:cx2="http://schemas.microsoft.com/office/drawing/2015/10/21/chartex" xmlns:cx3="http://schemas.microsoft.com/office/drawing/2016/5/9/chartex" xmlns:cx4="http://schemas.microsoft.com/office/drawing/2016/5/10/chartex" xmlns:cx5="http://schemas.microsoft.com/office/drawing/2016/5/11/chartex" xmlns:cx6="http://schemas.microsoft.com/office/drawing/2016/5/12/chartex" xmlns:cx7="http://schemas.microsoft.com/office/drawing/2016/5/13/chartex" xmlns:cx8="http://schemas.microsoft.com/office/drawing/2016/5/14/chartex" xmlns:mc="http://schemas.openxmlformats.org/markup-compatibility/2006" xmlns:aink="http://schemas.microsoft.com/office/drawing/2016/ink" xmlns:am3d="http://schemas.microsoft.com/office/drawing/2017/model3d" xmlns:o="urn:schemas-microsoft-com:office:office" xmlns:oel="http://schemas.microsoft.com/office/2019/extlst" xmlns:r="http://schemas.openxmlformats.org/officeDocument/2006/relationships" xmlns:m="http://schemas.openxmlformats.org/officeDocument/2006/math" xmlns:v="urn:schemas-microsoft-com:vml" xmlns:wp14="http://schemas.microsoft.com/office/word/2010/wordprocessingDrawing" xmlns:wp="http://schemas.openxmlformats.org/drawingml/2006/wordprocessingDrawing" xmlns:w10="urn:schemas-microsoft-com:office:word" xmlns:w="http://schemas.openxmlformats.org/wordprocessingml/2006/main" xmlns:w14="http://schemas.microsoft.com/office/word/2010/wordml" xmlns:w15="http://schemas.microsoft.com/office/word/2012/wordml" xmlns:w16cex="http://schemas.microsoft.com/office/word/2018/wordml/cex" xmlns:w16cid="http://schemas.microsoft.com/office/word/2016/wordml/cid" xmlns:w16="http://schemas.microsoft.com/office/word/2018/wordml" xmlns:w16sdtdh="http://schemas.microsoft.com/office/word/2020/wordml/sdtdatahash" xmlns:w16se="http://schemas.microsoft.com/office/word/2015/wordml/symex" xmlns:wpg="http://schemas.microsoft.com/office/word/2010/wordprocessingGroup" xmlns:wpi="http://schemas.microsoft.com/office/word/2010/wordprocessingInk" xmlns:wne="http://schemas.microsoft.com/office/word/2006/wordml" xmlns:wps="http://schemas.microsoft.com/office/word/2010/wordprocessingShape" mc:Ignorable="w14 w15 w16se w16cid w16 w16cex w16sdtdh wp14">
   <w:body>
+    <w:p>
+      <w:pPr>
+        <w:pStyle w:val="Heading1"/>
+        <w:bidi w:val="0"/>
+        <w:jc w:val="center"/>
+        <w:rPr>
+          <w:rFonts w:eastAsia="MS Mincho"/>
+          <w:sz w:val="36"/>
+          <w:szCs w:val="36"/>
+        </w:rPr>
+      </w:pPr>
+      <w:r>
+        <w:rPr>
+          <w:rFonts w:eastAsia="MS Mincho"/>
+          <w:sz w:val="36"/>
+          <w:szCs w:val="36"/>
+        </w:rPr>
+        <w:t>Key vocabularies</w:t>
+      </w:r>
+    </w:p>
+    <w:p>
+      <w:pPr>
+        <w:pStyle w:val="Heading1"/>
+        <w:jc w:val="center"/>
+        <w:rPr>
+          <w:rFonts w:eastAsia="MS Mincho"/>
+          <w:sz w:val="36"/>
+          <w:szCs w:val="36"/>
+        </w:rPr>
+      </w:pPr>
+      <w:r>
+        <w:rPr>
+          <w:rFonts w:eastAsia="MS Mincho"/>
+          <w:sz w:val="36"/>
+          <w:szCs w:val="36"/>
+          <w:rtl/>
+        </w:rPr>
+        <w:t>المفردات الرئيسيه</w:t>
+      </w:r>
+    </w:p>
     <w:tbl>
       <w:tblPr>
         <w:tblStyle w:val="TableGrid"/>
@@ -31,137 +71,6 @@
         </w:trPr>
         <w:tc>
           <w:tcPr>
-            <w:tcW w:w="5000" w:type="pct"/>
-            <w:gridSpan w:val="5"/>
-            <w:tcBorders>
-              <w:top w:val="dotted" w:sz="4" w:space="0" w:color="auto"/>
-              <w:left w:val="double" w:sz="4" w:space="0" w:color="auto"/>
-              <w:bottom w:val="dotted" w:sz="4" w:space="0" w:color="auto"/>
-              <w:right w:val="double" w:sz="4" w:space="0" w:color="auto"/>
-            </w:tcBorders>
-            <w:shd w:val="clear" w:color="auto" w:fill="000000" w:themeFill="text1"/>
-          </w:tcPr>
-          <w:p>
-            <w:pPr>
-              <w:jc w:val="center"/>
-              <w:rPr>
-                <w:rFonts w:ascii="Arial Black" w:hAnsi="Arial Black" w:cstheme="minorHAnsi"/>
-                <w:b/>
-                <w:bCs/>
-                <w:color w:val="FFFFFF" w:themeColor="background1"/>
-                <w:sz w:val="28"/>
-                <w:szCs w:val="28"/>
-                <w:rtl/>
-              </w:rPr>
-            </w:pPr>
-            <w:bookmarkStart w:id="0" w:name="_Hlk175569528"/>
-            <w:r>
-              <w:rPr>
-                <w:rFonts w:ascii="Arial Black" w:hAnsi="Arial Black" w:cstheme="minorHAnsi"/>
-                <w:b/>
-                <w:bCs/>
-                <w:color w:val="FFFFFF" w:themeColor="background1"/>
-                <w:sz w:val="28"/>
-                <w:szCs w:val="28"/>
-              </w:rPr>
-              <w:t xml:space="preserve">Key vocabularies </w:t>
-            </w:r>
-            <w:r>
-              <w:rPr>
-                <w:rFonts w:ascii="Arial Black" w:hAnsi="Arial Black" w:cstheme="minorHAnsi"/>
-                <w:b/>
-                <w:bCs/>
-                <w:color w:val="FFFFFF" w:themeColor="background1"/>
-                <w:sz w:val="28"/>
-                <w:szCs w:val="28"/>
-                <w:rtl/>
-              </w:rPr>
-              <w:t xml:space="preserve"> المفردات </w:t>
-            </w:r>
-            <w:proofErr w:type="spellStart"/>
-            <w:r>
-              <w:rPr>
-                <w:rFonts w:ascii="Arial Black" w:hAnsi="Arial Black" w:cstheme="minorHAnsi"/>
-                <w:b/>
-                <w:bCs/>
-                <w:color w:val="FFFFFF" w:themeColor="background1"/>
-                <w:sz w:val="28"/>
-                <w:szCs w:val="28"/>
-                <w:rtl/>
-              </w:rPr>
-              <w:t>الرئيسيه</w:t>
-            </w:r>
-            <w:proofErr w:type="spellEnd"/>
-            <w:r>
-              <w:rPr>
-                <w:rFonts w:ascii="Arial Black" w:hAnsi="Arial Black" w:cstheme="minorHAnsi"/>
-                <w:b/>
-                <w:bCs/>
-                <w:color w:val="FFFFFF" w:themeColor="background1"/>
-                <w:sz w:val="28"/>
-                <w:szCs w:val="28"/>
-                <w:rtl/>
-              </w:rPr>
-              <w:t xml:space="preserve">          </w:t>
-            </w:r>
-            <w:r>
-              <w:rPr>
-                <w:rFonts w:ascii="Arial Black" w:hAnsi="Arial Black" w:cstheme="minorHAnsi" w:hint="cs"/>
-                <w:b/>
-                <w:bCs/>
-                <w:color w:val="FFFFFF" w:themeColor="background1"/>
-                <w:sz w:val="28"/>
-                <w:szCs w:val="28"/>
-                <w:rtl/>
-              </w:rPr>
-              <w:t xml:space="preserve">   </w:t>
-            </w:r>
-            <w:r>
-              <w:rPr>
-                <w:rFonts w:ascii="Arial Black" w:hAnsi="Arial Black" w:cstheme="minorHAnsi" w:hint="cs"/>
-                <w:b/>
-                <w:bCs/>
-                <w:color w:val="FFFFFF" w:themeColor="background1"/>
-                <w:sz w:val="28"/>
-                <w:szCs w:val="28"/>
-                <w:rtl/>
-              </w:rPr>
-              <w:t xml:space="preserve">      </w:t>
-            </w:r>
-            <w:r>
-              <w:rPr>
-                <w:rFonts w:ascii="Arial Black" w:hAnsi="Arial Black" w:cstheme="minorHAnsi" w:hint="cs"/>
-                <w:b/>
-                <w:bCs/>
-                <w:color w:val="FFFFFF" w:themeColor="background1"/>
-                <w:sz w:val="28"/>
-                <w:szCs w:val="28"/>
-                <w:rtl/>
-              </w:rPr>
-              <w:t xml:space="preserve"> </w:t>
-            </w:r>
-            <w:r>
-              <w:rPr>
-                <w:rFonts w:ascii="Arial Black" w:hAnsi="Arial Black" w:cstheme="minorHAnsi"/>
-                <w:b/>
-                <w:bCs/>
-                <w:color w:val="FFFFFF" w:themeColor="background1"/>
-                <w:sz w:val="28"/>
-                <w:szCs w:val="28"/>
-                <w:rtl/>
-              </w:rPr>
-              <w:t xml:space="preserve">      </w:t>
-            </w:r>
-          </w:p>
-        </w:tc>
-      </w:tr>
-      <w:tr>
-        <w:trPr>
-          <w:trHeight w:val="20"/>
-          <w:jc w:val="center"/>
-        </w:trPr>
-        <w:tc>
-          <w:tcPr>
             <w:tcW w:w="1245" w:type="pct"/>
             <w:tcBorders>
               <w:top w:val="dotted" w:sz="4" w:space="0" w:color="auto"/>
@@ -181,6 +90,7 @@
                 <w:szCs w:val="26"/>
               </w:rPr>
             </w:pPr>
+            <w:bookmarkStart w:id="0" w:name="_Hlk175569528"/>
             <w:r>
               <w:rPr>
                 <w:rFonts w:ascii="Calibri" w:hAnsi="Calibri" w:cs="Calibri"/>
@@ -223,7 +133,6 @@
                 <w:lang w:bidi="ar-DZ"/>
               </w:rPr>
             </w:pPr>
-            <w:proofErr w:type="spellStart"/>
             <w:r>
               <w:rPr>
                 <w:rFonts w:eastAsiaTheme="minorHAnsi" w:cs="Calibri"/>
@@ -232,31 +141,8 @@
                 <w:szCs w:val="26"/>
                 <w:lang w:bidi="ar-DZ"/>
               </w:rPr>
-              <w:t>يتواصل</w:t>
+              <w:t>يتواصل مع</w:t>
             </w:r>
-            <w:proofErr w:type="spellEnd"/>
-            <w:r>
-              <w:rPr>
-                <w:rFonts w:eastAsiaTheme="minorHAnsi" w:cs="Calibri"/>
-                <w:color w:val="000000" w:themeColor="text1"/>
-                <w:sz w:val="26"/>
-                <w:szCs w:val="26"/>
-                <w:lang w:bidi="ar-DZ"/>
-              </w:rPr>
-              <w:t xml:space="preserve"> </w:t>
-            </w:r>
-            <w:proofErr w:type="spellStart"/>
-            <w:r>
-              <w:rPr>
-                <w:rFonts w:eastAsiaTheme="minorHAnsi" w:cs="Calibri"/>
-                <w:color w:val="000000" w:themeColor="text1"/>
-                <w:sz w:val="26"/>
-                <w:szCs w:val="26"/>
-                <w:lang w:bidi="ar-DZ"/>
-              </w:rPr>
-              <w:t>مع</w:t>
-            </w:r>
-            <w:proofErr w:type="spellEnd"/>
           </w:p>
         </w:tc>
         <w:tc>
@@ -401,7 +287,6 @@
                 <w:lang w:bidi="ar-DZ"/>
               </w:rPr>
             </w:pPr>
-            <w:proofErr w:type="spellStart"/>
             <w:r>
               <w:rPr>
                 <w:rFonts w:eastAsiaTheme="minorHAnsi" w:cs="Calibri"/>
@@ -412,7 +297,6 @@
               </w:rPr>
               <w:t>تواصل</w:t>
             </w:r>
-            <w:proofErr w:type="spellEnd"/>
           </w:p>
         </w:tc>
         <w:tc>
@@ -472,7 +356,6 @@
                 <w:lang w:bidi="ar-DZ"/>
               </w:rPr>
             </w:pPr>
-            <w:proofErr w:type="spellStart"/>
             <w:r>
               <w:rPr>
                 <w:rFonts w:eastAsiaTheme="minorHAnsi" w:cs="Calibri"/>
@@ -481,53 +364,8 @@
                 <w:szCs w:val="26"/>
                 <w:lang w:bidi="ar-DZ"/>
               </w:rPr>
-              <w:t>مرتب</w:t>
+              <w:t>مرتب بشكل صحيح</w:t>
             </w:r>
-            <w:proofErr w:type="spellEnd"/>
-            <w:r>
-              <w:rPr>
-                <w:rFonts w:eastAsiaTheme="minorHAnsi" w:cs="Calibri"/>
-                <w:color w:val="000000" w:themeColor="text1"/>
-                <w:sz w:val="26"/>
-                <w:szCs w:val="26"/>
-                <w:lang w:bidi="ar-DZ"/>
-              </w:rPr>
-              <w:t xml:space="preserve"> </w:t>
-            </w:r>
-            <w:proofErr w:type="spellStart"/>
-            <w:r>
-              <w:rPr>
-                <w:rFonts w:eastAsiaTheme="minorHAnsi" w:cs="Calibri"/>
-                <w:color w:val="000000" w:themeColor="text1"/>
-                <w:sz w:val="26"/>
-                <w:szCs w:val="26"/>
-                <w:lang w:bidi="ar-DZ"/>
-              </w:rPr>
-              <w:t>بشكل</w:t>
-            </w:r>
-            <w:proofErr w:type="spellEnd"/>
-            <w:r>
-              <w:rPr>
-                <w:rFonts w:eastAsiaTheme="minorHAnsi" w:cs="Calibri"/>
-                <w:color w:val="000000" w:themeColor="text1"/>
-                <w:sz w:val="26"/>
-                <w:szCs w:val="26"/>
-                <w:lang w:bidi="ar-DZ"/>
-              </w:rPr>
-              <w:t xml:space="preserve"> </w:t>
-            </w:r>
-            <w:proofErr w:type="spellStart"/>
-            <w:r>
-              <w:rPr>
-                <w:rFonts w:eastAsiaTheme="minorHAnsi" w:cs="Calibri"/>
-                <w:color w:val="000000" w:themeColor="text1"/>
-                <w:sz w:val="26"/>
-                <w:szCs w:val="26"/>
-                <w:lang w:bidi="ar-DZ"/>
-              </w:rPr>
-              <w:t>صحيح</w:t>
-            </w:r>
-            <w:proofErr w:type="spellEnd"/>
           </w:p>
         </w:tc>
       </w:tr>
@@ -610,7 +448,6 @@
                 <w:lang w:bidi="ar-DZ"/>
               </w:rPr>
             </w:pPr>
-            <w:proofErr w:type="spellStart"/>
             <w:r>
               <w:rPr>
                 <w:rFonts w:eastAsiaTheme="minorHAnsi" w:cs="Calibri"/>
@@ -619,31 +456,8 @@
                 <w:szCs w:val="26"/>
                 <w:lang w:bidi="ar-DZ"/>
               </w:rPr>
-              <w:t>سوء</w:t>
+              <w:t>سوء التواصل</w:t>
             </w:r>
-            <w:proofErr w:type="spellEnd"/>
-            <w:r>
-              <w:rPr>
-                <w:rFonts w:eastAsiaTheme="minorHAnsi" w:cs="Calibri"/>
-                <w:color w:val="000000" w:themeColor="text1"/>
-                <w:sz w:val="26"/>
-                <w:szCs w:val="26"/>
-                <w:lang w:bidi="ar-DZ"/>
-              </w:rPr>
-              <w:t xml:space="preserve"> </w:t>
-            </w:r>
-            <w:proofErr w:type="spellStart"/>
-            <w:r>
-              <w:rPr>
-                <w:rFonts w:eastAsiaTheme="minorHAnsi" w:cs="Calibri"/>
-                <w:color w:val="000000" w:themeColor="text1"/>
-                <w:sz w:val="26"/>
-                <w:szCs w:val="26"/>
-                <w:lang w:bidi="ar-DZ"/>
-              </w:rPr>
-              <w:t>التواصل</w:t>
-            </w:r>
-            <w:proofErr w:type="spellEnd"/>
           </w:p>
         </w:tc>
         <w:tc>
@@ -713,7 +527,6 @@
                 <w:lang w:bidi="ar-DZ"/>
               </w:rPr>
             </w:pPr>
-            <w:proofErr w:type="spellStart"/>
             <w:r>
               <w:rPr>
                 <w:rFonts w:eastAsiaTheme="minorHAnsi" w:cs="Calibri"/>
@@ -722,31 +535,8 @@
                 <w:szCs w:val="26"/>
                 <w:lang w:bidi="ar-DZ"/>
               </w:rPr>
-              <w:t>محترم</w:t>
+              <w:t>محترم للآخرين</w:t>
             </w:r>
-            <w:proofErr w:type="spellEnd"/>
-            <w:r>
-              <w:rPr>
-                <w:rFonts w:eastAsiaTheme="minorHAnsi" w:cs="Calibri"/>
-                <w:color w:val="000000" w:themeColor="text1"/>
-                <w:sz w:val="26"/>
-                <w:szCs w:val="26"/>
-                <w:lang w:bidi="ar-DZ"/>
-              </w:rPr>
-              <w:t xml:space="preserve"> </w:t>
-            </w:r>
-            <w:proofErr w:type="spellStart"/>
-            <w:r>
-              <w:rPr>
-                <w:rFonts w:eastAsiaTheme="minorHAnsi" w:cs="Calibri"/>
-                <w:color w:val="000000" w:themeColor="text1"/>
-                <w:sz w:val="26"/>
-                <w:szCs w:val="26"/>
-                <w:lang w:bidi="ar-DZ"/>
-              </w:rPr>
-              <w:t>للآخرين</w:t>
-            </w:r>
-            <w:proofErr w:type="spellEnd"/>
           </w:p>
         </w:tc>
       </w:tr>
@@ -823,7 +613,6 @@
                 <w:lang w:bidi="ar-DZ"/>
               </w:rPr>
             </w:pPr>
-            <w:proofErr w:type="spellStart"/>
             <w:r>
               <w:rPr>
                 <w:rFonts w:eastAsiaTheme="minorHAnsi" w:cs="Calibri"/>
@@ -832,31 +621,8 @@
                 <w:szCs w:val="26"/>
                 <w:lang w:bidi="ar-DZ"/>
               </w:rPr>
-              <w:t>اتصال</w:t>
+              <w:t>اتصال / تواصل</w:t>
             </w:r>
-            <w:proofErr w:type="spellEnd"/>
-            <w:r>
-              <w:rPr>
-                <w:rFonts w:eastAsiaTheme="minorHAnsi" w:cs="Calibri"/>
-                <w:color w:val="000000" w:themeColor="text1"/>
-                <w:sz w:val="26"/>
-                <w:szCs w:val="26"/>
-                <w:lang w:bidi="ar-DZ"/>
-              </w:rPr>
-              <w:t xml:space="preserve"> / </w:t>
-            </w:r>
-            <w:proofErr w:type="spellStart"/>
-            <w:r>
-              <w:rPr>
-                <w:rFonts w:eastAsiaTheme="minorHAnsi" w:cs="Calibri"/>
-                <w:color w:val="000000" w:themeColor="text1"/>
-                <w:sz w:val="26"/>
-                <w:szCs w:val="26"/>
-                <w:lang w:bidi="ar-DZ"/>
-              </w:rPr>
-              <w:t>تواصل</w:t>
-            </w:r>
-            <w:proofErr w:type="spellEnd"/>
           </w:p>
         </w:tc>
         <w:tc>
@@ -918,7 +684,6 @@
                 <w:lang w:bidi="ar-DZ"/>
               </w:rPr>
             </w:pPr>
-            <w:proofErr w:type="spellStart"/>
             <w:r>
               <w:rPr>
                 <w:rFonts w:eastAsiaTheme="minorHAnsi" w:cs="Calibri"/>
@@ -927,31 +692,8 @@
                 <w:szCs w:val="26"/>
                 <w:lang w:bidi="ar-DZ"/>
               </w:rPr>
-              <w:t>صراع</w:t>
+              <w:t>صراع / نزاع</w:t>
             </w:r>
-            <w:proofErr w:type="spellEnd"/>
-            <w:r>
-              <w:rPr>
-                <w:rFonts w:eastAsiaTheme="minorHAnsi" w:cs="Calibri"/>
-                <w:color w:val="000000" w:themeColor="text1"/>
-                <w:sz w:val="26"/>
-                <w:szCs w:val="26"/>
-                <w:lang w:bidi="ar-DZ"/>
-              </w:rPr>
-              <w:t xml:space="preserve"> / </w:t>
-            </w:r>
-            <w:proofErr w:type="spellStart"/>
-            <w:r>
-              <w:rPr>
-                <w:rFonts w:eastAsiaTheme="minorHAnsi" w:cs="Calibri"/>
-                <w:color w:val="000000" w:themeColor="text1"/>
-                <w:sz w:val="26"/>
-                <w:szCs w:val="26"/>
-                <w:lang w:bidi="ar-DZ"/>
-              </w:rPr>
-              <w:t>نزاع</w:t>
-            </w:r>
-            <w:proofErr w:type="spellEnd"/>
           </w:p>
         </w:tc>
       </w:tr>
@@ -1019,7 +761,6 @@
                 <w:lang w:bidi="ar-DZ"/>
               </w:rPr>
             </w:pPr>
-            <w:proofErr w:type="spellStart"/>
             <w:r>
               <w:rPr>
                 <w:rFonts w:eastAsiaTheme="minorHAnsi" w:cs="Calibri"/>
@@ -1028,53 +769,8 @@
                 <w:szCs w:val="26"/>
                 <w:lang w:bidi="ar-DZ"/>
               </w:rPr>
-              <w:t>علاقة</w:t>
+              <w:t>علاقة / ارتباط / صلة</w:t>
             </w:r>
-            <w:proofErr w:type="spellEnd"/>
-            <w:r>
-              <w:rPr>
-                <w:rFonts w:eastAsiaTheme="minorHAnsi" w:cs="Calibri"/>
-                <w:color w:val="000000" w:themeColor="text1"/>
-                <w:sz w:val="26"/>
-                <w:szCs w:val="26"/>
-                <w:lang w:bidi="ar-DZ"/>
-              </w:rPr>
-              <w:t xml:space="preserve"> / </w:t>
-            </w:r>
-            <w:proofErr w:type="spellStart"/>
-            <w:r>
-              <w:rPr>
-                <w:rFonts w:eastAsiaTheme="minorHAnsi" w:cs="Calibri"/>
-                <w:color w:val="000000" w:themeColor="text1"/>
-                <w:sz w:val="26"/>
-                <w:szCs w:val="26"/>
-                <w:lang w:bidi="ar-DZ"/>
-              </w:rPr>
-              <w:t>ارتباط</w:t>
-            </w:r>
-            <w:proofErr w:type="spellEnd"/>
-            <w:r>
-              <w:rPr>
-                <w:rFonts w:eastAsiaTheme="minorHAnsi" w:cs="Calibri"/>
-                <w:color w:val="000000" w:themeColor="text1"/>
-                <w:sz w:val="26"/>
-                <w:szCs w:val="26"/>
-                <w:lang w:bidi="ar-DZ"/>
-              </w:rPr>
-              <w:t xml:space="preserve"> / </w:t>
-            </w:r>
-            <w:proofErr w:type="spellStart"/>
-            <w:r>
-              <w:rPr>
-                <w:rFonts w:eastAsiaTheme="minorHAnsi" w:cs="Calibri"/>
-                <w:color w:val="000000" w:themeColor="text1"/>
-                <w:sz w:val="26"/>
-                <w:szCs w:val="26"/>
-                <w:lang w:bidi="ar-DZ"/>
-              </w:rPr>
-              <w:t>صلة</w:t>
-            </w:r>
-            <w:proofErr w:type="spellEnd"/>
           </w:p>
         </w:tc>
         <w:tc>
@@ -1145,7 +841,6 @@
                 <w:lang w:bidi="ar-DZ"/>
               </w:rPr>
             </w:pPr>
-            <w:proofErr w:type="spellStart"/>
             <w:r>
               <w:rPr>
                 <w:rFonts w:eastAsiaTheme="minorHAnsi" w:cs="Calibri"/>
@@ -1154,31 +849,8 @@
                 <w:szCs w:val="26"/>
                 <w:lang w:bidi="ar-DZ"/>
               </w:rPr>
-              <w:t>مساند</w:t>
+              <w:t>مساند / داعم</w:t>
             </w:r>
-            <w:proofErr w:type="spellEnd"/>
-            <w:r>
-              <w:rPr>
-                <w:rFonts w:eastAsiaTheme="minorHAnsi" w:cs="Calibri"/>
-                <w:color w:val="000000" w:themeColor="text1"/>
-                <w:sz w:val="26"/>
-                <w:szCs w:val="26"/>
-                <w:lang w:bidi="ar-DZ"/>
-              </w:rPr>
-              <w:t xml:space="preserve"> / </w:t>
-            </w:r>
-            <w:proofErr w:type="spellStart"/>
-            <w:r>
-              <w:rPr>
-                <w:rFonts w:eastAsiaTheme="minorHAnsi" w:cs="Calibri"/>
-                <w:color w:val="000000" w:themeColor="text1"/>
-                <w:sz w:val="26"/>
-                <w:szCs w:val="26"/>
-                <w:lang w:bidi="ar-DZ"/>
-              </w:rPr>
-              <w:t>داعم</w:t>
-            </w:r>
-            <w:proofErr w:type="spellEnd"/>
           </w:p>
         </w:tc>
       </w:tr>
@@ -1254,7 +926,6 @@
                 <w:lang w:bidi="ar-DZ"/>
               </w:rPr>
             </w:pPr>
-            <w:proofErr w:type="spellStart"/>
             <w:r>
               <w:rPr>
                 <w:rFonts w:eastAsiaTheme="minorHAnsi" w:cs="Calibri"/>
@@ -1263,31 +934,8 @@
                 <w:szCs w:val="26"/>
                 <w:lang w:bidi="ar-DZ"/>
               </w:rPr>
-              <w:t>يسيء</w:t>
+              <w:t>يسيء فهم</w:t>
             </w:r>
-            <w:proofErr w:type="spellEnd"/>
-            <w:r>
-              <w:rPr>
-                <w:rFonts w:eastAsiaTheme="minorHAnsi" w:cs="Calibri"/>
-                <w:color w:val="000000" w:themeColor="text1"/>
-                <w:sz w:val="26"/>
-                <w:szCs w:val="26"/>
-                <w:lang w:bidi="ar-DZ"/>
-              </w:rPr>
-              <w:t xml:space="preserve"> </w:t>
-            </w:r>
-            <w:proofErr w:type="spellStart"/>
-            <w:r>
-              <w:rPr>
-                <w:rFonts w:eastAsiaTheme="minorHAnsi" w:cs="Calibri"/>
-                <w:color w:val="000000" w:themeColor="text1"/>
-                <w:sz w:val="26"/>
-                <w:szCs w:val="26"/>
-                <w:lang w:bidi="ar-DZ"/>
-              </w:rPr>
-              <w:t>فهم</w:t>
-            </w:r>
-            <w:proofErr w:type="spellEnd"/>
           </w:p>
         </w:tc>
         <w:tc>
@@ -1349,7 +997,6 @@
                 <w:lang w:bidi="ar-DZ"/>
               </w:rPr>
             </w:pPr>
-            <w:proofErr w:type="spellStart"/>
             <w:r>
               <w:rPr>
                 <w:rFonts w:eastAsiaTheme="minorHAnsi" w:cs="Calibri"/>
@@ -1360,7 +1007,6 @@
               </w:rPr>
               <w:t>يحل</w:t>
             </w:r>
-            <w:proofErr w:type="spellEnd"/>
           </w:p>
         </w:tc>
       </w:tr>
@@ -1454,7 +1100,6 @@
                 <w:lang w:bidi="ar-DZ"/>
               </w:rPr>
             </w:pPr>
-            <w:proofErr w:type="spellStart"/>
             <w:r>
               <w:rPr>
                 <w:rFonts w:eastAsiaTheme="minorHAnsi" w:cs="Calibri"/>
@@ -1463,53 +1108,8 @@
                 <w:szCs w:val="26"/>
                 <w:lang w:bidi="ar-DZ"/>
               </w:rPr>
-              <w:t>سوء</w:t>
+              <w:t>سوء فهم / خلاف</w:t>
             </w:r>
-            <w:proofErr w:type="spellEnd"/>
-            <w:r>
-              <w:rPr>
-                <w:rFonts w:eastAsiaTheme="minorHAnsi" w:cs="Calibri"/>
-                <w:color w:val="000000" w:themeColor="text1"/>
-                <w:sz w:val="26"/>
-                <w:szCs w:val="26"/>
-                <w:lang w:bidi="ar-DZ"/>
-              </w:rPr>
-              <w:t xml:space="preserve"> </w:t>
-            </w:r>
-            <w:proofErr w:type="spellStart"/>
-            <w:r>
-              <w:rPr>
-                <w:rFonts w:eastAsiaTheme="minorHAnsi" w:cs="Calibri"/>
-                <w:color w:val="000000" w:themeColor="text1"/>
-                <w:sz w:val="26"/>
-                <w:szCs w:val="26"/>
-                <w:lang w:bidi="ar-DZ"/>
-              </w:rPr>
-              <w:t>فهم</w:t>
-            </w:r>
-            <w:proofErr w:type="spellEnd"/>
-            <w:r>
-              <w:rPr>
-                <w:rFonts w:eastAsiaTheme="minorHAnsi" w:cs="Calibri"/>
-                <w:color w:val="000000" w:themeColor="text1"/>
-                <w:sz w:val="26"/>
-                <w:szCs w:val="26"/>
-                <w:lang w:bidi="ar-DZ"/>
-              </w:rPr>
-              <w:t xml:space="preserve"> / </w:t>
-            </w:r>
-            <w:proofErr w:type="spellStart"/>
-            <w:r>
-              <w:rPr>
-                <w:rFonts w:eastAsiaTheme="minorHAnsi" w:cs="Calibri"/>
-                <w:color w:val="000000" w:themeColor="text1"/>
-                <w:sz w:val="26"/>
-                <w:szCs w:val="26"/>
-                <w:lang w:bidi="ar-DZ"/>
-              </w:rPr>
-              <w:t>خلاف</w:t>
-            </w:r>
-            <w:proofErr w:type="spellEnd"/>
           </w:p>
         </w:tc>
         <w:tc>
@@ -1589,7 +1189,6 @@
                 <w:lang w:bidi="ar-DZ"/>
               </w:rPr>
             </w:pPr>
-            <w:proofErr w:type="spellStart"/>
             <w:r>
               <w:rPr>
                 <w:rFonts w:eastAsiaTheme="minorHAnsi" w:cs="Calibri"/>
@@ -1598,228 +1197,84 @@
                 <w:szCs w:val="26"/>
                 <w:lang w:bidi="ar-DZ"/>
               </w:rPr>
-              <w:t>المراسلة</w:t>
-            </w:r>
-            <w:proofErr w:type="spellEnd"/>
-            <w:r>
-              <w:rPr>
-                <w:rFonts w:eastAsiaTheme="minorHAnsi" w:cs="Calibri"/>
-                <w:color w:val="000000" w:themeColor="text1"/>
-                <w:sz w:val="26"/>
-                <w:szCs w:val="26"/>
-                <w:lang w:bidi="ar-DZ"/>
-              </w:rPr>
-              <w:t xml:space="preserve"> / </w:t>
-            </w:r>
-            <w:proofErr w:type="spellStart"/>
-            <w:r>
-              <w:rPr>
-                <w:rFonts w:eastAsiaTheme="minorHAnsi" w:cs="Calibri"/>
-                <w:color w:val="000000" w:themeColor="text1"/>
-                <w:sz w:val="26"/>
-                <w:szCs w:val="26"/>
-                <w:lang w:bidi="ar-DZ"/>
-              </w:rPr>
-              <w:t>إرسال</w:t>
-            </w:r>
-            <w:proofErr w:type="spellEnd"/>
-            <w:r>
-              <w:rPr>
-                <w:rFonts w:eastAsiaTheme="minorHAnsi" w:cs="Calibri"/>
-                <w:color w:val="000000" w:themeColor="text1"/>
-                <w:sz w:val="26"/>
-                <w:szCs w:val="26"/>
-                <w:lang w:bidi="ar-DZ"/>
-              </w:rPr>
-              <w:t xml:space="preserve"> </w:t>
-            </w:r>
-            <w:proofErr w:type="spellStart"/>
-            <w:r>
-              <w:rPr>
-                <w:rFonts w:eastAsiaTheme="minorHAnsi" w:cs="Calibri"/>
-                <w:color w:val="000000" w:themeColor="text1"/>
-                <w:sz w:val="26"/>
-                <w:szCs w:val="26"/>
-                <w:lang w:bidi="ar-DZ"/>
-              </w:rPr>
-              <w:t>الرسائل</w:t>
-            </w:r>
-            <w:proofErr w:type="spellEnd"/>
-          </w:p>
-        </w:tc>
-      </w:tr>
-      <w:tr>
-        <w:trPr>
-          <w:trHeight w:val="576"/>
-          <w:jc w:val="center"/>
-        </w:trPr>
-        <w:tc>
-          <w:tcPr>
-            <w:tcW w:w="5000" w:type="pct"/>
-            <w:gridSpan w:val="5"/>
-            <w:tcBorders>
-              <w:top w:val="dotted" w:sz="4" w:space="0" w:color="auto"/>
-              <w:left w:val="nil"/>
-              <w:bottom w:val="dotted" w:sz="4" w:space="0" w:color="auto"/>
-              <w:right w:val="nil"/>
-            </w:tcBorders>
-            <w:vAlign w:val="center"/>
-          </w:tcPr>
-          <w:p>
-            <w:pPr>
-              <w:pStyle w:val="NoSpacing"/>
-              <w:bidi/>
-              <w:spacing w:line="276" w:lineRule="auto"/>
-              <w:rPr>
-                <w:rFonts w:eastAsiaTheme="minorHAnsi" w:cs="Calibri"/>
-                <w:color w:val="000000" w:themeColor="text1"/>
-                <w:sz w:val="26"/>
-                <w:szCs w:val="26"/>
-                <w:lang w:bidi="ar-DZ"/>
-              </w:rPr>
-            </w:pPr>
-          </w:p>
-        </w:tc>
-      </w:tr>
-      <w:tr>
-        <w:trPr>
-          <w:trHeight w:val="20"/>
-          <w:jc w:val="center"/>
-        </w:trPr>
-        <w:tc>
-          <w:tcPr>
-            <w:tcW w:w="5000" w:type="pct"/>
-            <w:gridSpan w:val="5"/>
-            <w:tcBorders>
-              <w:top w:val="dotted" w:sz="4" w:space="0" w:color="auto"/>
-              <w:left w:val="double" w:sz="4" w:space="0" w:color="auto"/>
-              <w:bottom w:val="dotted" w:sz="4" w:space="0" w:color="auto"/>
-              <w:right w:val="double" w:sz="4" w:space="0" w:color="auto"/>
-            </w:tcBorders>
-            <w:shd w:val="clear" w:color="auto" w:fill="000000" w:themeFill="text1"/>
-          </w:tcPr>
-          <w:p>
-            <w:pPr>
-              <w:jc w:val="center"/>
-              <w:rPr>
-                <w:rFonts w:ascii="Arial Black" w:hAnsi="Arial Black"/>
-                <w:b/>
-                <w:bCs/>
-                <w:color w:val="FFFFFF" w:themeColor="background1"/>
-                <w:sz w:val="28"/>
-                <w:szCs w:val="28"/>
-                <w14:shadow w14:blurRad="38100" w14:dist="19050" w14:dir="2700000" w14:sx="100000" w14:sy="100000" w14:kx="0" w14:ky="0" w14:algn="tl">
-                  <w14:schemeClr w14:val="dk1">
-                    <w14:alpha w14:val="60000"/>
-                  </w14:schemeClr>
-                </w14:shadow>
-                <w14:textOutline w14:w="0" w14:cap="flat" w14:cmpd="sng" w14:algn="ctr">
-                  <w14:noFill/>
-                  <w14:prstDash w14:val="solid"/>
-                  <w14:round/>
-                </w14:textOutline>
-              </w:rPr>
-            </w:pPr>
-            <w:r>
-              <w:rPr>
-                <w:rFonts w:ascii="Arial Black" w:hAnsi="Arial Black" w:cstheme="minorHAnsi"/>
-                <w:b/>
-                <w:bCs/>
-                <w:color w:val="FFFFFF" w:themeColor="background1"/>
-                <w:sz w:val="28"/>
-                <w:szCs w:val="28"/>
-              </w:rPr>
-              <w:t xml:space="preserve">Extra vocabularies </w:t>
-            </w:r>
-            <w:r>
-              <w:rPr>
-                <w:rFonts w:ascii="Arial Black" w:hAnsi="Arial Black" w:cstheme="minorHAnsi"/>
-                <w:b/>
-                <w:bCs/>
-                <w:color w:val="FFFFFF" w:themeColor="background1"/>
-                <w:sz w:val="28"/>
-                <w:szCs w:val="28"/>
-                <w:rtl/>
-              </w:rPr>
-              <w:t xml:space="preserve"> المفردات </w:t>
-            </w:r>
-            <w:proofErr w:type="spellStart"/>
-            <w:r>
-              <w:rPr>
-                <w:rFonts w:ascii="Arial Black" w:hAnsi="Arial Black" w:cstheme="minorHAnsi"/>
-                <w:b/>
-                <w:bCs/>
-                <w:color w:val="FFFFFF" w:themeColor="background1"/>
-                <w:sz w:val="28"/>
-                <w:szCs w:val="28"/>
-                <w:rtl/>
-              </w:rPr>
-              <w:t>الاضافيه</w:t>
-            </w:r>
-            <w:proofErr w:type="spellEnd"/>
-            <w:r>
-              <w:rPr>
-                <w:rFonts w:ascii="Arial Black" w:hAnsi="Arial Black" w:cstheme="minorHAnsi"/>
-                <w:b/>
-                <w:bCs/>
-                <w:color w:val="FFFFFF" w:themeColor="background1"/>
-                <w:sz w:val="28"/>
-                <w:szCs w:val="28"/>
-                <w:rtl/>
-              </w:rPr>
-              <w:t xml:space="preserve"> </w:t>
-            </w:r>
-            <w:r>
-              <w:rPr>
-                <w:rFonts w:ascii="Arial Black" w:hAnsi="Arial Black" w:cstheme="minorHAnsi" w:hint="cs"/>
-                <w:b/>
-                <w:bCs/>
-                <w:color w:val="FFFFFF" w:themeColor="background1"/>
-                <w:sz w:val="28"/>
-                <w:szCs w:val="28"/>
-                <w:rtl/>
-              </w:rPr>
-              <w:t xml:space="preserve">           </w:t>
-            </w:r>
-            <w:r>
-              <w:rPr>
-                <w:rFonts w:ascii="Arial Black" w:hAnsi="Arial Black" w:cstheme="minorHAnsi" w:hint="cs"/>
-                <w:b/>
-                <w:bCs/>
-                <w:color w:val="FFFFFF" w:themeColor="background1"/>
-                <w:sz w:val="28"/>
-                <w:szCs w:val="28"/>
-                <w:rtl/>
-              </w:rPr>
-              <w:t xml:space="preserve">     </w:t>
-            </w:r>
-            <w:r>
-              <w:rPr>
-                <w:rFonts w:ascii="Arial Black" w:hAnsi="Arial Black" w:cstheme="minorHAnsi" w:hint="cs"/>
-                <w:b/>
-                <w:bCs/>
-                <w:color w:val="FFFFFF" w:themeColor="background1"/>
-                <w:sz w:val="28"/>
-                <w:szCs w:val="28"/>
-                <w:rtl/>
-              </w:rPr>
-              <w:t xml:space="preserve">    </w:t>
-            </w:r>
-            <w:r>
-              <w:rPr>
-                <w:rFonts w:ascii="Arial Black" w:hAnsi="Arial Black" w:cstheme="minorHAnsi"/>
-                <w:b/>
-                <w:bCs/>
-                <w:color w:val="FFFFFF" w:themeColor="background1"/>
-                <w:sz w:val="28"/>
-                <w:szCs w:val="28"/>
-                <w:rtl/>
-              </w:rPr>
-              <w:t xml:space="preserve">  </w:t>
+              <w:t>المراسلة / إرسال الرسائل</w:t>
             </w:r>
           </w:p>
         </w:tc>
       </w:tr>
+    </w:tbl>
+    <w:p/>
+    <w:p>
+      <w:pPr>
+        <w:pStyle w:val="Heading1"/>
+        <w:bidi w:val="0"/>
+        <w:jc w:val="center"/>
+        <w:rPr>
+          <w:rFonts w:eastAsia="MS Mincho"/>
+          <w:sz w:val="36"/>
+          <w:szCs w:val="36"/>
+        </w:rPr>
+      </w:pPr>
+      <w:r>
+        <w:rPr>
+          <w:rFonts w:eastAsia="MS Mincho"/>
+          <w:sz w:val="36"/>
+          <w:szCs w:val="36"/>
+        </w:rPr>
+        <w:t xml:space="preserve">Extra vocabularies </w:t>
+      </w:r>
+      <w:r>
+        <w:rPr>
+          <w:rFonts w:eastAsia="MS Mincho"/>
+          <w:sz w:val="36"/>
+          <w:szCs w:val="36"/>
+          <w:rtl/>
+        </w:rPr>
+        <w:t xml:space="preserve"> </w:t>
+      </w:r>
+    </w:p>
+    <w:p>
+      <w:pPr>
+        <w:pStyle w:val="Heading1"/>
+        <w:jc w:val="center"/>
+        <w:rPr>
+          <w:rFonts w:eastAsia="MS Mincho"/>
+          <w:sz w:val="36"/>
+          <w:szCs w:val="36"/>
+        </w:rPr>
+      </w:pPr>
+      <w:r>
+        <w:rPr>
+          <w:rFonts w:eastAsia="MS Mincho"/>
+          <w:sz w:val="36"/>
+          <w:szCs w:val="36"/>
+          <w:rtl/>
+        </w:rPr>
+        <w:t>المفردات الاضافيه</w:t>
+      </w:r>
+    </w:p>
+    <w:p/>
+    <w:tbl>
+      <w:tblPr>
+        <w:tblStyle w:val="TableGrid"/>
+        <w:tblW w:w="5000" w:type="pct"/>
+        <w:jc w:val="center"/>
+        <w:tblBorders>
+          <w:top w:val="dashSmallGap" w:sz="4" w:space="0" w:color="auto"/>
+          <w:left w:val="dashSmallGap" w:sz="4" w:space="0" w:color="auto"/>
+          <w:bottom w:val="dashSmallGap" w:sz="4" w:space="0" w:color="auto"/>
+          <w:right w:val="dashSmallGap" w:sz="4" w:space="0" w:color="auto"/>
+          <w:insideH w:val="dashSmallGap" w:sz="4" w:space="0" w:color="auto"/>
+          <w:insideV w:val="dashSmallGap" w:sz="4" w:space="0" w:color="auto"/>
+        </w:tblBorders>
+        <w:tblLook w:val="04A0" w:firstRow="1" w:lastRow="0" w:firstColumn="1" w:lastColumn="0" w:noHBand="0" w:noVBand="1"/>
+      </w:tblPr>
+      <w:tblGrid>
+        <w:gridCol w:w="2630"/>
+        <w:gridCol w:w="2644"/>
+        <w:gridCol w:w="2631"/>
+        <w:gridCol w:w="2661"/>
+      </w:tblGrid>
       <w:tr>
         <w:trPr>
           <w:trHeight w:val="20"/>
@@ -1881,7 +1336,6 @@
                 <w:lang w:bidi="ar-DZ"/>
               </w:rPr>
             </w:pPr>
-            <w:proofErr w:type="spellStart"/>
             <w:r>
               <w:rPr>
                 <w:rFonts w:eastAsiaTheme="minorHAnsi" w:cs="Calibri"/>
@@ -1890,37 +1344,13 @@
                 <w:szCs w:val="26"/>
                 <w:lang w:bidi="ar-DZ"/>
               </w:rPr>
-              <w:t>رسالة</w:t>
+              <w:t>رسالة نصية</w:t>
             </w:r>
-            <w:proofErr w:type="spellEnd"/>
-            <w:r>
-              <w:rPr>
-                <w:rFonts w:eastAsiaTheme="minorHAnsi" w:cs="Calibri"/>
-                <w:color w:val="000000" w:themeColor="text1"/>
-                <w:sz w:val="26"/>
-                <w:szCs w:val="26"/>
-                <w:lang w:bidi="ar-DZ"/>
-              </w:rPr>
-              <w:t xml:space="preserve"> </w:t>
-            </w:r>
-            <w:proofErr w:type="spellStart"/>
-            <w:r>
-              <w:rPr>
-                <w:rFonts w:eastAsiaTheme="minorHAnsi" w:cs="Calibri"/>
-                <w:color w:val="000000" w:themeColor="text1"/>
-                <w:sz w:val="26"/>
-                <w:szCs w:val="26"/>
-                <w:lang w:bidi="ar-DZ"/>
-              </w:rPr>
-              <w:t>نصية</w:t>
-            </w:r>
-            <w:proofErr w:type="spellEnd"/>
           </w:p>
         </w:tc>
         <w:tc>
           <w:tcPr>
             <w:tcW w:w="1245" w:type="pct"/>
-            <w:gridSpan w:val="2"/>
             <w:tcBorders>
               <w:top w:val="dotted" w:sz="4" w:space="0" w:color="auto"/>
               <w:left w:val="double" w:sz="4" w:space="0" w:color="auto"/>
@@ -1974,7 +1404,6 @@
                 <w:lang w:bidi="ar-DZ"/>
               </w:rPr>
             </w:pPr>
-            <w:proofErr w:type="spellStart"/>
             <w:r>
               <w:rPr>
                 <w:rFonts w:eastAsiaTheme="minorHAnsi" w:cs="Calibri"/>
@@ -1985,7 +1414,6 @@
               </w:rPr>
               <w:t>يتجنب</w:t>
             </w:r>
-            <w:proofErr w:type="spellEnd"/>
           </w:p>
         </w:tc>
       </w:tr>
@@ -2053,7 +1481,6 @@
                 <w:lang w:bidi="ar-DZ"/>
               </w:rPr>
             </w:pPr>
-            <w:proofErr w:type="spellStart"/>
             <w:r>
               <w:rPr>
                 <w:rFonts w:eastAsiaTheme="minorHAnsi" w:cs="Calibri"/>
@@ -2062,37 +1489,13 @@
                 <w:szCs w:val="26"/>
                 <w:lang w:bidi="ar-DZ"/>
               </w:rPr>
-              <w:t>يهتم</w:t>
+              <w:t>يهتم / يرعى</w:t>
             </w:r>
-            <w:proofErr w:type="spellEnd"/>
-            <w:r>
-              <w:rPr>
-                <w:rFonts w:eastAsiaTheme="minorHAnsi" w:cs="Calibri"/>
-                <w:color w:val="000000" w:themeColor="text1"/>
-                <w:sz w:val="26"/>
-                <w:szCs w:val="26"/>
-                <w:lang w:bidi="ar-DZ"/>
-              </w:rPr>
-              <w:t xml:space="preserve"> / </w:t>
-            </w:r>
-            <w:proofErr w:type="spellStart"/>
-            <w:r>
-              <w:rPr>
-                <w:rFonts w:eastAsiaTheme="minorHAnsi" w:cs="Calibri"/>
-                <w:color w:val="000000" w:themeColor="text1"/>
-                <w:sz w:val="26"/>
-                <w:szCs w:val="26"/>
-                <w:lang w:bidi="ar-DZ"/>
-              </w:rPr>
-              <w:t>يرعى</w:t>
-            </w:r>
-            <w:proofErr w:type="spellEnd"/>
           </w:p>
         </w:tc>
         <w:tc>
           <w:tcPr>
             <w:tcW w:w="1245" w:type="pct"/>
-            <w:gridSpan w:val="2"/>
             <w:tcBorders>
               <w:top w:val="dotted" w:sz="4" w:space="0" w:color="auto"/>
               <w:left w:val="double" w:sz="4" w:space="0" w:color="auto"/>
@@ -2148,7 +1551,6 @@
                 <w:lang w:bidi="ar-DZ"/>
               </w:rPr>
             </w:pPr>
-            <w:proofErr w:type="spellStart"/>
             <w:r>
               <w:rPr>
                 <w:rFonts w:eastAsiaTheme="minorHAnsi" w:cs="Calibri"/>
@@ -2157,31 +1559,8 @@
                 <w:szCs w:val="26"/>
                 <w:lang w:bidi="ar-DZ"/>
               </w:rPr>
-              <w:t>منزعج</w:t>
+              <w:t>منزعج / حزين</w:t>
             </w:r>
-            <w:proofErr w:type="spellEnd"/>
-            <w:r>
-              <w:rPr>
-                <w:rFonts w:eastAsiaTheme="minorHAnsi" w:cs="Calibri"/>
-                <w:color w:val="000000" w:themeColor="text1"/>
-                <w:sz w:val="26"/>
-                <w:szCs w:val="26"/>
-                <w:lang w:bidi="ar-DZ"/>
-              </w:rPr>
-              <w:t xml:space="preserve"> / </w:t>
-            </w:r>
-            <w:proofErr w:type="spellStart"/>
-            <w:r>
-              <w:rPr>
-                <w:rFonts w:eastAsiaTheme="minorHAnsi" w:cs="Calibri"/>
-                <w:color w:val="000000" w:themeColor="text1"/>
-                <w:sz w:val="26"/>
-                <w:szCs w:val="26"/>
-                <w:lang w:bidi="ar-DZ"/>
-              </w:rPr>
-              <w:t>حزين</w:t>
-            </w:r>
-            <w:proofErr w:type="spellEnd"/>
           </w:p>
         </w:tc>
       </w:tr>
@@ -2249,7 +1628,6 @@
                 <w:lang w:bidi="ar-DZ"/>
               </w:rPr>
             </w:pPr>
-            <w:proofErr w:type="spellStart"/>
             <w:r>
               <w:rPr>
                 <w:rFonts w:eastAsiaTheme="minorHAnsi" w:cs="Calibri"/>
@@ -2258,59 +1636,13 @@
                 <w:szCs w:val="26"/>
                 <w:lang w:bidi="ar-DZ"/>
               </w:rPr>
-              <w:t>وسائل</w:t>
+              <w:t>وسائل التواصل الاجتماعي</w:t>
             </w:r>
-            <w:proofErr w:type="spellEnd"/>
-            <w:r>
-              <w:rPr>
-                <w:rFonts w:eastAsiaTheme="minorHAnsi" w:cs="Calibri"/>
-                <w:color w:val="000000" w:themeColor="text1"/>
-                <w:sz w:val="26"/>
-                <w:szCs w:val="26"/>
-                <w:lang w:bidi="ar-DZ"/>
-              </w:rPr>
-              <w:t xml:space="preserve"> </w:t>
-            </w:r>
-            <w:proofErr w:type="spellStart"/>
-            <w:r>
-              <w:rPr>
-                <w:rFonts w:eastAsiaTheme="minorHAnsi" w:cs="Calibri"/>
-                <w:color w:val="000000" w:themeColor="text1"/>
-                <w:sz w:val="26"/>
-                <w:szCs w:val="26"/>
-                <w:lang w:bidi="ar-DZ"/>
-              </w:rPr>
-              <w:t>التواصل</w:t>
-            </w:r>
-            <w:proofErr w:type="spellEnd"/>
-            <w:r>
-              <w:rPr>
-                <w:rFonts w:eastAsiaTheme="minorHAnsi" w:cs="Calibri"/>
-                <w:color w:val="000000" w:themeColor="text1"/>
-                <w:sz w:val="26"/>
-                <w:szCs w:val="26"/>
-                <w:lang w:bidi="ar-DZ"/>
-              </w:rPr>
-              <w:t xml:space="preserve"> </w:t>
-            </w:r>
-            <w:proofErr w:type="spellStart"/>
-            <w:r>
-              <w:rPr>
-                <w:rFonts w:eastAsiaTheme="minorHAnsi" w:cs="Calibri"/>
-                <w:color w:val="000000" w:themeColor="text1"/>
-                <w:sz w:val="26"/>
-                <w:szCs w:val="26"/>
-                <w:lang w:bidi="ar-DZ"/>
-              </w:rPr>
-              <w:t>الاجتماعي</w:t>
-            </w:r>
-            <w:proofErr w:type="spellEnd"/>
           </w:p>
         </w:tc>
         <w:tc>
           <w:tcPr>
             <w:tcW w:w="1245" w:type="pct"/>
-            <w:gridSpan w:val="2"/>
             <w:tcBorders>
               <w:top w:val="dotted" w:sz="4" w:space="0" w:color="auto"/>
               <w:left w:val="double" w:sz="4" w:space="0" w:color="auto"/>
@@ -2375,7 +1707,6 @@
                 <w:lang w:bidi="ar-DZ"/>
               </w:rPr>
             </w:pPr>
-            <w:proofErr w:type="spellStart"/>
             <w:r>
               <w:rPr>
                 <w:rFonts w:eastAsiaTheme="minorHAnsi" w:cs="Calibri"/>
@@ -2384,53 +1715,8 @@
                 <w:szCs w:val="26"/>
                 <w:lang w:bidi="ar-DZ"/>
               </w:rPr>
-              <w:t>مفهوم</w:t>
+              <w:t>مفهوم / ذو معنى</w:t>
             </w:r>
-            <w:proofErr w:type="spellEnd"/>
-            <w:r>
-              <w:rPr>
-                <w:rFonts w:eastAsiaTheme="minorHAnsi" w:cs="Calibri"/>
-                <w:color w:val="000000" w:themeColor="text1"/>
-                <w:sz w:val="26"/>
-                <w:szCs w:val="26"/>
-                <w:lang w:bidi="ar-DZ"/>
-              </w:rPr>
-              <w:t xml:space="preserve"> / </w:t>
-            </w:r>
-            <w:proofErr w:type="spellStart"/>
-            <w:r>
-              <w:rPr>
-                <w:rFonts w:eastAsiaTheme="minorHAnsi" w:cs="Calibri"/>
-                <w:color w:val="000000" w:themeColor="text1"/>
-                <w:sz w:val="26"/>
-                <w:szCs w:val="26"/>
-                <w:lang w:bidi="ar-DZ"/>
-              </w:rPr>
-              <w:t>ذو</w:t>
-            </w:r>
-            <w:proofErr w:type="spellEnd"/>
-            <w:r>
-              <w:rPr>
-                <w:rFonts w:eastAsiaTheme="minorHAnsi" w:cs="Calibri"/>
-                <w:color w:val="000000" w:themeColor="text1"/>
-                <w:sz w:val="26"/>
-                <w:szCs w:val="26"/>
-                <w:lang w:bidi="ar-DZ"/>
-              </w:rPr>
-              <w:t xml:space="preserve"> </w:t>
-            </w:r>
-            <w:proofErr w:type="spellStart"/>
-            <w:r>
-              <w:rPr>
-                <w:rFonts w:eastAsiaTheme="minorHAnsi" w:cs="Calibri"/>
-                <w:color w:val="000000" w:themeColor="text1"/>
-                <w:sz w:val="26"/>
-                <w:szCs w:val="26"/>
-                <w:lang w:bidi="ar-DZ"/>
-              </w:rPr>
-              <w:t>معنى</w:t>
-            </w:r>
-            <w:proofErr w:type="spellEnd"/>
           </w:p>
         </w:tc>
       </w:tr>
@@ -2506,7 +1792,6 @@
                 <w:lang w:bidi="ar-DZ"/>
               </w:rPr>
             </w:pPr>
-            <w:proofErr w:type="spellStart"/>
             <w:r>
               <w:rPr>
                 <w:rFonts w:eastAsiaTheme="minorHAnsi" w:cs="Calibri"/>
@@ -2515,37 +1800,13 @@
                 <w:szCs w:val="26"/>
                 <w:lang w:bidi="ar-DZ"/>
               </w:rPr>
-              <w:t>بعد</w:t>
+              <w:t>بعد / مسافة</w:t>
             </w:r>
-            <w:proofErr w:type="spellEnd"/>
-            <w:r>
-              <w:rPr>
-                <w:rFonts w:eastAsiaTheme="minorHAnsi" w:cs="Calibri"/>
-                <w:color w:val="000000" w:themeColor="text1"/>
-                <w:sz w:val="26"/>
-                <w:szCs w:val="26"/>
-                <w:lang w:bidi="ar-DZ"/>
-              </w:rPr>
-              <w:t xml:space="preserve"> / </w:t>
-            </w:r>
-            <w:proofErr w:type="spellStart"/>
-            <w:r>
-              <w:rPr>
-                <w:rFonts w:eastAsiaTheme="minorHAnsi" w:cs="Calibri"/>
-                <w:color w:val="000000" w:themeColor="text1"/>
-                <w:sz w:val="26"/>
-                <w:szCs w:val="26"/>
-                <w:lang w:bidi="ar-DZ"/>
-              </w:rPr>
-              <w:t>مسافة</w:t>
-            </w:r>
-            <w:proofErr w:type="spellEnd"/>
           </w:p>
         </w:tc>
         <w:tc>
           <w:tcPr>
             <w:tcW w:w="1245" w:type="pct"/>
-            <w:gridSpan w:val="2"/>
             <w:tcBorders>
               <w:top w:val="dotted" w:sz="4" w:space="0" w:color="auto"/>
               <w:left w:val="double" w:sz="4" w:space="0" w:color="auto"/>
@@ -2602,7 +1863,6 @@
                 <w:lang w:bidi="ar-DZ"/>
               </w:rPr>
             </w:pPr>
-            <w:proofErr w:type="spellStart"/>
             <w:r>
               <w:rPr>
                 <w:rFonts w:eastAsiaTheme="minorHAnsi" w:cs="Calibri"/>
@@ -2611,31 +1871,8 @@
                 <w:szCs w:val="26"/>
                 <w:lang w:bidi="ar-DZ"/>
               </w:rPr>
-              <w:t>جاد</w:t>
+              <w:t>جاد / خطير</w:t>
             </w:r>
-            <w:proofErr w:type="spellEnd"/>
-            <w:r>
-              <w:rPr>
-                <w:rFonts w:eastAsiaTheme="minorHAnsi" w:cs="Calibri"/>
-                <w:color w:val="000000" w:themeColor="text1"/>
-                <w:sz w:val="26"/>
-                <w:szCs w:val="26"/>
-                <w:lang w:bidi="ar-DZ"/>
-              </w:rPr>
-              <w:t xml:space="preserve"> / </w:t>
-            </w:r>
-            <w:proofErr w:type="spellStart"/>
-            <w:r>
-              <w:rPr>
-                <w:rFonts w:eastAsiaTheme="minorHAnsi" w:cs="Calibri"/>
-                <w:color w:val="000000" w:themeColor="text1"/>
-                <w:sz w:val="26"/>
-                <w:szCs w:val="26"/>
-                <w:lang w:bidi="ar-DZ"/>
-              </w:rPr>
-              <w:t>خطير</w:t>
-            </w:r>
-            <w:proofErr w:type="spellEnd"/>
           </w:p>
         </w:tc>
       </w:tr>
@@ -2711,7 +1948,6 @@
                 <w:lang w:bidi="ar-DZ"/>
               </w:rPr>
             </w:pPr>
-            <w:proofErr w:type="spellStart"/>
             <w:r>
               <w:rPr>
                 <w:rFonts w:eastAsiaTheme="minorHAnsi" w:cs="Calibri"/>
@@ -2720,37 +1956,13 @@
                 <w:szCs w:val="26"/>
                 <w:lang w:bidi="ar-DZ"/>
               </w:rPr>
-              <w:t>يقوي</w:t>
+              <w:t>يقوي / يدعم</w:t>
             </w:r>
-            <w:proofErr w:type="spellEnd"/>
-            <w:r>
-              <w:rPr>
-                <w:rFonts w:eastAsiaTheme="minorHAnsi" w:cs="Calibri"/>
-                <w:color w:val="000000" w:themeColor="text1"/>
-                <w:sz w:val="26"/>
-                <w:szCs w:val="26"/>
-                <w:lang w:bidi="ar-DZ"/>
-              </w:rPr>
-              <w:t xml:space="preserve"> / </w:t>
-            </w:r>
-            <w:proofErr w:type="spellStart"/>
-            <w:r>
-              <w:rPr>
-                <w:rFonts w:eastAsiaTheme="minorHAnsi" w:cs="Calibri"/>
-                <w:color w:val="000000" w:themeColor="text1"/>
-                <w:sz w:val="26"/>
-                <w:szCs w:val="26"/>
-                <w:lang w:bidi="ar-DZ"/>
-              </w:rPr>
-              <w:t>يدعم</w:t>
-            </w:r>
-            <w:proofErr w:type="spellEnd"/>
           </w:p>
         </w:tc>
         <w:tc>
           <w:tcPr>
             <w:tcW w:w="1245" w:type="pct"/>
-            <w:gridSpan w:val="2"/>
             <w:tcBorders>
               <w:top w:val="dotted" w:sz="4" w:space="0" w:color="auto"/>
               <w:left w:val="double" w:sz="4" w:space="0" w:color="auto"/>
@@ -2815,7 +2027,6 @@
                 <w:lang w:bidi="ar-DZ"/>
               </w:rPr>
             </w:pPr>
-            <w:proofErr w:type="spellStart"/>
             <w:r>
               <w:rPr>
                 <w:rFonts w:eastAsiaTheme="minorHAnsi" w:cs="Calibri"/>
@@ -2824,31 +2035,8 @@
                 <w:szCs w:val="26"/>
                 <w:lang w:bidi="ar-DZ"/>
               </w:rPr>
-              <w:t>بصوت</w:t>
+              <w:t>بصوت مرتفع</w:t>
             </w:r>
-            <w:proofErr w:type="spellEnd"/>
-            <w:r>
-              <w:rPr>
-                <w:rFonts w:eastAsiaTheme="minorHAnsi" w:cs="Calibri"/>
-                <w:color w:val="000000" w:themeColor="text1"/>
-                <w:sz w:val="26"/>
-                <w:szCs w:val="26"/>
-                <w:lang w:bidi="ar-DZ"/>
-              </w:rPr>
-              <w:t xml:space="preserve"> </w:t>
-            </w:r>
-            <w:proofErr w:type="spellStart"/>
-            <w:r>
-              <w:rPr>
-                <w:rFonts w:eastAsiaTheme="minorHAnsi" w:cs="Calibri"/>
-                <w:color w:val="000000" w:themeColor="text1"/>
-                <w:sz w:val="26"/>
-                <w:szCs w:val="26"/>
-                <w:lang w:bidi="ar-DZ"/>
-              </w:rPr>
-              <w:t>مرتفع</w:t>
-            </w:r>
-            <w:proofErr w:type="spellEnd"/>
           </w:p>
         </w:tc>
       </w:tr>
@@ -2933,7 +2121,6 @@
                 <w:lang w:bidi="ar-DZ"/>
               </w:rPr>
             </w:pPr>
-            <w:proofErr w:type="spellStart"/>
             <w:r>
               <w:rPr>
                 <w:rFonts w:eastAsiaTheme="minorHAnsi" w:cs="Calibri"/>
@@ -2942,37 +2129,13 @@
                 <w:szCs w:val="26"/>
                 <w:lang w:bidi="ar-DZ"/>
               </w:rPr>
-              <w:t>مؤيد</w:t>
+              <w:t>مؤيد / معزز</w:t>
             </w:r>
-            <w:proofErr w:type="spellEnd"/>
-            <w:r>
-              <w:rPr>
-                <w:rFonts w:eastAsiaTheme="minorHAnsi" w:cs="Calibri"/>
-                <w:color w:val="000000" w:themeColor="text1"/>
-                <w:sz w:val="26"/>
-                <w:szCs w:val="26"/>
-                <w:lang w:bidi="ar-DZ"/>
-              </w:rPr>
-              <w:t xml:space="preserve"> / </w:t>
-            </w:r>
-            <w:proofErr w:type="spellStart"/>
-            <w:r>
-              <w:rPr>
-                <w:rFonts w:eastAsiaTheme="minorHAnsi" w:cs="Calibri"/>
-                <w:color w:val="000000" w:themeColor="text1"/>
-                <w:sz w:val="26"/>
-                <w:szCs w:val="26"/>
-                <w:lang w:bidi="ar-DZ"/>
-              </w:rPr>
-              <w:t>معزز</w:t>
-            </w:r>
-            <w:proofErr w:type="spellEnd"/>
           </w:p>
         </w:tc>
         <w:tc>
           <w:tcPr>
             <w:tcW w:w="1245" w:type="pct"/>
-            <w:gridSpan w:val="2"/>
             <w:tcBorders>
               <w:top w:val="dotted" w:sz="4" w:space="0" w:color="auto"/>
               <w:left w:val="double" w:sz="4" w:space="0" w:color="auto"/>
@@ -3028,7 +2191,6 @@
                 <w:lang w:bidi="ar-DZ"/>
               </w:rPr>
             </w:pPr>
-            <w:proofErr w:type="spellStart"/>
             <w:r>
               <w:rPr>
                 <w:rFonts w:eastAsiaTheme="minorHAnsi" w:cs="Calibri"/>
@@ -3037,31 +2199,8 @@
                 <w:szCs w:val="26"/>
                 <w:lang w:bidi="ar-DZ"/>
               </w:rPr>
-              <w:t>جولة</w:t>
+              <w:t>جولة / قيادة</w:t>
             </w:r>
-            <w:proofErr w:type="spellEnd"/>
-            <w:r>
-              <w:rPr>
-                <w:rFonts w:eastAsiaTheme="minorHAnsi" w:cs="Calibri"/>
-                <w:color w:val="000000" w:themeColor="text1"/>
-                <w:sz w:val="26"/>
-                <w:szCs w:val="26"/>
-                <w:lang w:bidi="ar-DZ"/>
-              </w:rPr>
-              <w:t xml:space="preserve"> / </w:t>
-            </w:r>
-            <w:proofErr w:type="spellStart"/>
-            <w:r>
-              <w:rPr>
-                <w:rFonts w:eastAsiaTheme="minorHAnsi" w:cs="Calibri"/>
-                <w:color w:val="000000" w:themeColor="text1"/>
-                <w:sz w:val="26"/>
-                <w:szCs w:val="26"/>
-                <w:lang w:bidi="ar-DZ"/>
-              </w:rPr>
-              <w:t>قيادة</w:t>
-            </w:r>
-            <w:proofErr w:type="spellEnd"/>
           </w:p>
         </w:tc>
       </w:tr>
@@ -3136,7 +2275,6 @@
                 <w:lang w:bidi="ar-DZ"/>
               </w:rPr>
             </w:pPr>
-            <w:proofErr w:type="spellStart"/>
             <w:r>
               <w:rPr>
                 <w:rFonts w:eastAsiaTheme="minorHAnsi" w:cs="Calibri"/>
@@ -3145,37 +2283,13 @@
                 <w:szCs w:val="26"/>
                 <w:lang w:bidi="ar-DZ"/>
               </w:rPr>
-              <w:t>يندمج</w:t>
+              <w:t>يندمج في</w:t>
             </w:r>
-            <w:proofErr w:type="spellEnd"/>
-            <w:r>
-              <w:rPr>
-                <w:rFonts w:eastAsiaTheme="minorHAnsi" w:cs="Calibri"/>
-                <w:color w:val="000000" w:themeColor="text1"/>
-                <w:sz w:val="26"/>
-                <w:szCs w:val="26"/>
-                <w:lang w:bidi="ar-DZ"/>
-              </w:rPr>
-              <w:t xml:space="preserve"> </w:t>
-            </w:r>
-            <w:proofErr w:type="spellStart"/>
-            <w:r>
-              <w:rPr>
-                <w:rFonts w:eastAsiaTheme="minorHAnsi" w:cs="Calibri"/>
-                <w:color w:val="000000" w:themeColor="text1"/>
-                <w:sz w:val="26"/>
-                <w:szCs w:val="26"/>
-                <w:lang w:bidi="ar-DZ"/>
-              </w:rPr>
-              <w:t>في</w:t>
-            </w:r>
-            <w:proofErr w:type="spellEnd"/>
           </w:p>
         </w:tc>
         <w:tc>
           <w:tcPr>
             <w:tcW w:w="1245" w:type="pct"/>
-            <w:gridSpan w:val="2"/>
             <w:tcBorders>
               <w:top w:val="dotted" w:sz="4" w:space="0" w:color="auto"/>
               <w:left w:val="double" w:sz="4" w:space="0" w:color="auto"/>
@@ -3231,7 +2345,6 @@
                 <w:lang w:bidi="ar-DZ"/>
               </w:rPr>
             </w:pPr>
-            <w:proofErr w:type="spellStart"/>
             <w:r>
               <w:rPr>
                 <w:rFonts w:eastAsiaTheme="minorHAnsi" w:cs="Calibri"/>
@@ -3242,7 +2355,6 @@
               </w:rPr>
               <w:t>حل</w:t>
             </w:r>
-            <w:proofErr w:type="spellEnd"/>
           </w:p>
         </w:tc>
       </w:tr>
@@ -3332,7 +2444,6 @@
                 <w:lang w:bidi="ar-DZ"/>
               </w:rPr>
             </w:pPr>
-            <w:proofErr w:type="spellStart"/>
             <w:r>
               <w:rPr>
                 <w:rFonts w:eastAsiaTheme="minorHAnsi" w:cs="Calibri"/>
@@ -3341,81 +2452,13 @@
                 <w:szCs w:val="26"/>
                 <w:lang w:bidi="ar-DZ"/>
               </w:rPr>
-              <w:t>يبقى</w:t>
+              <w:t>يبقى عالقًا في الذهن</w:t>
             </w:r>
-            <w:proofErr w:type="spellEnd"/>
-            <w:r>
-              <w:rPr>
-                <w:rFonts w:eastAsiaTheme="minorHAnsi" w:cs="Calibri"/>
-                <w:color w:val="000000" w:themeColor="text1"/>
-                <w:sz w:val="26"/>
-                <w:szCs w:val="26"/>
-                <w:lang w:bidi="ar-DZ"/>
-              </w:rPr>
-              <w:t xml:space="preserve"> </w:t>
-            </w:r>
-            <w:proofErr w:type="spellStart"/>
-            <w:r>
-              <w:rPr>
-                <w:rFonts w:eastAsiaTheme="minorHAnsi" w:cs="Calibri"/>
-                <w:color w:val="000000" w:themeColor="text1"/>
-                <w:sz w:val="26"/>
-                <w:szCs w:val="26"/>
-                <w:lang w:bidi="ar-DZ"/>
-              </w:rPr>
-              <w:t>عالقًا</w:t>
-            </w:r>
-            <w:proofErr w:type="spellEnd"/>
-            <w:r>
-              <w:rPr>
-                <w:rFonts w:eastAsiaTheme="minorHAnsi" w:cs="Calibri"/>
-                <w:color w:val="000000" w:themeColor="text1"/>
-                <w:sz w:val="26"/>
-                <w:szCs w:val="26"/>
-                <w:lang w:bidi="ar-DZ"/>
-              </w:rPr>
-              <w:t xml:space="preserve"> </w:t>
-            </w:r>
-            <w:proofErr w:type="spellStart"/>
-            <w:r>
-              <w:rPr>
-                <w:rFonts w:eastAsiaTheme="minorHAnsi" w:cs="Calibri"/>
-                <w:color w:val="000000" w:themeColor="text1"/>
-                <w:sz w:val="26"/>
-                <w:szCs w:val="26"/>
-                <w:lang w:bidi="ar-DZ"/>
-              </w:rPr>
-              <w:t>في</w:t>
-            </w:r>
-            <w:proofErr w:type="spellEnd"/>
-            <w:r>
-              <w:rPr>
-                <w:rFonts w:eastAsiaTheme="minorHAnsi" w:cs="Calibri"/>
-                <w:color w:val="000000" w:themeColor="text1"/>
-                <w:sz w:val="26"/>
-                <w:szCs w:val="26"/>
-                <w:lang w:bidi="ar-DZ"/>
-              </w:rPr>
-              <w:t xml:space="preserve"> </w:t>
-            </w:r>
-            <w:proofErr w:type="spellStart"/>
-            <w:r>
-              <w:rPr>
-                <w:rFonts w:eastAsiaTheme="minorHAnsi" w:cs="Calibri"/>
-                <w:color w:val="000000" w:themeColor="text1"/>
-                <w:sz w:val="26"/>
-                <w:szCs w:val="26"/>
-                <w:lang w:bidi="ar-DZ"/>
-              </w:rPr>
-              <w:t>الذهن</w:t>
-            </w:r>
-            <w:proofErr w:type="spellEnd"/>
           </w:p>
         </w:tc>
         <w:tc>
           <w:tcPr>
             <w:tcW w:w="1245" w:type="pct"/>
-            <w:gridSpan w:val="2"/>
             <w:tcBorders>
               <w:top w:val="dotted" w:sz="4" w:space="0" w:color="auto"/>
               <w:left w:val="double" w:sz="4" w:space="0" w:color="auto"/>
@@ -3477,7 +2520,6 @@
                 <w:lang w:bidi="ar-DZ"/>
               </w:rPr>
             </w:pPr>
-            <w:proofErr w:type="spellStart"/>
             <w:r>
               <w:rPr>
                 <w:rFonts w:eastAsiaTheme="minorHAnsi" w:cs="Calibri"/>
@@ -3486,36 +2528,70 @@
                 <w:szCs w:val="26"/>
                 <w:lang w:bidi="ar-DZ"/>
               </w:rPr>
-              <w:t>يتميز</w:t>
+              <w:t>يتميز – يبرز</w:t>
             </w:r>
-            <w:proofErr w:type="spellEnd"/>
-            <w:r>
-              <w:rPr>
-                <w:rFonts w:eastAsiaTheme="minorHAnsi" w:cs="Calibri"/>
-                <w:color w:val="000000" w:themeColor="text1"/>
-                <w:sz w:val="26"/>
-                <w:szCs w:val="26"/>
-                <w:lang w:bidi="ar-DZ"/>
-              </w:rPr>
-              <w:t xml:space="preserve"> – </w:t>
-            </w:r>
-            <w:proofErr w:type="spellStart"/>
-            <w:r>
-              <w:rPr>
-                <w:rFonts w:eastAsiaTheme="minorHAnsi" w:cs="Calibri"/>
-                <w:color w:val="000000" w:themeColor="text1"/>
-                <w:sz w:val="26"/>
-                <w:szCs w:val="26"/>
-                <w:lang w:bidi="ar-DZ"/>
-              </w:rPr>
-              <w:t>يبرز</w:t>
-            </w:r>
-            <w:proofErr w:type="spellEnd"/>
           </w:p>
         </w:tc>
       </w:tr>
     </w:tbl>
-    <w:p/>
+    <w:p>
+      <w:pPr>
+        <w:pStyle w:val="Heading1"/>
+        <w:bidi w:val="0"/>
+        <w:jc w:val="center"/>
+        <w:rPr>
+          <w:rFonts w:eastAsia="MS Mincho"/>
+          <w:sz w:val="36"/>
+          <w:szCs w:val="36"/>
+        </w:rPr>
+      </w:pPr>
+      <w:r>
+        <w:rPr>
+          <w:rFonts w:eastAsia="MS Mincho"/>
+          <w:sz w:val="36"/>
+          <w:szCs w:val="36"/>
+        </w:rPr>
+        <w:t xml:space="preserve">Collocations, Prepositions </w:t>
+      </w:r>
+      <w:r>
+        <w:rPr>
+          <w:rFonts w:eastAsia="MS Mincho" w:hint="cs"/>
+          <w:sz w:val="36"/>
+          <w:szCs w:val="36"/>
+          <w:rtl/>
+        </w:rPr>
+        <w:t>&amp;</w:t>
+      </w:r>
+      <w:r>
+        <w:rPr>
+          <w:rFonts w:eastAsia="MS Mincho"/>
+          <w:sz w:val="36"/>
+          <w:szCs w:val="36"/>
+        </w:rPr>
+        <w:t xml:space="preserve"> Expressions</w:t>
+      </w:r>
+    </w:p>
+    <w:p>
+      <w:pPr>
+        <w:pStyle w:val="Heading1"/>
+        <w:jc w:val="center"/>
+        <w:rPr>
+          <w:rFonts w:eastAsia="MS Mincho"/>
+          <w:sz w:val="36"/>
+          <w:szCs w:val="36"/>
+          <w:rtl/>
+        </w:rPr>
+      </w:pPr>
+      <w:r>
+        <w:rPr>
+          <w:rFonts w:eastAsia="MS Mincho" w:hint="cs"/>
+          <w:sz w:val="36"/>
+          <w:szCs w:val="36"/>
+          <w:rtl/>
+        </w:rPr>
+        <w:t xml:space="preserve">حروف الجر والمصطلحات </w:t>
+      </w:r>
+    </w:p>
     <w:tbl>
       <w:tblPr>
         <w:tblW w:w="10411" w:type="dxa"/>
@@ -3531,83 +2607,6 @@
         <w:gridCol w:w="3138"/>
         <w:gridCol w:w="2068"/>
       </w:tblGrid>
-      <w:tr>
-        <w:trPr>
-          <w:trHeight w:val="20"/>
-        </w:trPr>
-        <w:tc>
-          <w:tcPr>
-            <w:tcW w:w="10411" w:type="dxa"/>
-            <w:gridSpan w:val="4"/>
-            <w:tcBorders>
-              <w:top w:val="dotted" w:sz="4" w:space="0" w:color="auto"/>
-              <w:bottom w:val="dotted" w:sz="4" w:space="0" w:color="auto"/>
-            </w:tcBorders>
-            <w:shd w:val="clear" w:color="auto" w:fill="000000" w:themeFill="text1"/>
-          </w:tcPr>
-          <w:p>
-            <w:pPr>
-              <w:spacing w:after="0"/>
-              <w:jc w:val="center"/>
-              <w:rPr>
-                <w:rFonts w:ascii="Arial Black" w:hAnsi="Arial Black" w:cstheme="minorHAnsi"/>
-                <w:b/>
-                <w:bCs/>
-                <w:color w:val="FFFFFF" w:themeColor="background1"/>
-                <w:sz w:val="25"/>
-                <w:szCs w:val="25"/>
-                <w:rtl/>
-              </w:rPr>
-            </w:pPr>
-            <w:r>
-              <w:rPr>
-                <w:rFonts w:ascii="Arial Black" w:hAnsi="Arial Black" w:cstheme="minorHAnsi"/>
-                <w:b/>
-                <w:bCs/>
-                <w:color w:val="FFFFFF" w:themeColor="background1"/>
-                <w:sz w:val="25"/>
-                <w:szCs w:val="25"/>
-              </w:rPr>
-              <w:t xml:space="preserve">Collocations, Prepositions </w:t>
-            </w:r>
-            <w:r>
-              <w:rPr>
-                <w:rFonts w:ascii="Arial Black" w:hAnsi="Arial Black" w:cstheme="minorHAnsi" w:hint="cs"/>
-                <w:b/>
-                <w:bCs/>
-                <w:color w:val="FFFFFF" w:themeColor="background1"/>
-                <w:sz w:val="25"/>
-                <w:szCs w:val="25"/>
-                <w:rtl/>
-              </w:rPr>
-              <w:t>&amp;</w:t>
-            </w:r>
-            <w:r>
-              <w:rPr>
-                <w:rFonts w:ascii="Arial Black" w:hAnsi="Arial Black" w:cstheme="minorHAnsi"/>
-                <w:b/>
-                <w:bCs/>
-                <w:color w:val="FFFFFF" w:themeColor="background1"/>
-                <w:sz w:val="25"/>
-                <w:szCs w:val="25"/>
-              </w:rPr>
-              <w:t xml:space="preserve"> Expressions</w:t>
-            </w:r>
-            <w:r>
-              <w:rPr>
-                <w:rFonts w:ascii="Arial Black" w:hAnsi="Arial Black" w:cstheme="minorHAnsi" w:hint="cs"/>
-                <w:b/>
-                <w:bCs/>
-                <w:color w:val="FFFFFF" w:themeColor="background1"/>
-                <w:sz w:val="25"/>
-                <w:szCs w:val="25"/>
-                <w:rtl/>
-              </w:rPr>
-              <w:t xml:space="preserve">حروف الجر والمصطلحات       </w:t>
-            </w:r>
-          </w:p>
-        </w:tc>
-      </w:tr>
       <w:tr>
         <w:trPr>
           <w:trHeight w:val="20"/>
@@ -3664,7 +2663,6 @@
                 <w:lang w:bidi="ar-DZ"/>
               </w:rPr>
             </w:pPr>
-            <w:proofErr w:type="spellStart"/>
             <w:r>
               <w:rPr>
                 <w:rFonts w:cs="Calibri"/>
@@ -3673,31 +2671,8 @@
                 <w:szCs w:val="26"/>
                 <w:lang w:bidi="ar-DZ"/>
               </w:rPr>
-              <w:t>يخصص</w:t>
+              <w:t>يخصص وقت</w:t>
             </w:r>
-            <w:proofErr w:type="spellEnd"/>
-            <w:r>
-              <w:rPr>
-                <w:rFonts w:cs="Calibri"/>
-                <w:color w:val="000000" w:themeColor="text1"/>
-                <w:sz w:val="26"/>
-                <w:szCs w:val="26"/>
-                <w:lang w:bidi="ar-DZ"/>
-              </w:rPr>
-              <w:t xml:space="preserve"> </w:t>
-            </w:r>
-            <w:proofErr w:type="spellStart"/>
-            <w:r>
-              <w:rPr>
-                <w:rFonts w:cs="Calibri"/>
-                <w:color w:val="000000" w:themeColor="text1"/>
-                <w:sz w:val="26"/>
-                <w:szCs w:val="26"/>
-                <w:lang w:bidi="ar-DZ"/>
-              </w:rPr>
-              <w:t>وقت</w:t>
-            </w:r>
-            <w:proofErr w:type="spellEnd"/>
           </w:p>
         </w:tc>
         <w:tc>
@@ -3752,7 +2727,6 @@
                 <w:lang w:bidi="ar-DZ"/>
               </w:rPr>
             </w:pPr>
-            <w:proofErr w:type="spellStart"/>
             <w:r>
               <w:rPr>
                 <w:rFonts w:cs="Calibri"/>
@@ -3761,31 +2735,8 @@
                 <w:szCs w:val="26"/>
                 <w:lang w:bidi="ar-DZ"/>
               </w:rPr>
-              <w:t>يلقي</w:t>
+              <w:t>يلقي نظرة</w:t>
             </w:r>
-            <w:proofErr w:type="spellEnd"/>
-            <w:r>
-              <w:rPr>
-                <w:rFonts w:cs="Calibri"/>
-                <w:color w:val="000000" w:themeColor="text1"/>
-                <w:sz w:val="26"/>
-                <w:szCs w:val="26"/>
-                <w:lang w:bidi="ar-DZ"/>
-              </w:rPr>
-              <w:t xml:space="preserve"> </w:t>
-            </w:r>
-            <w:proofErr w:type="spellStart"/>
-            <w:r>
-              <w:rPr>
-                <w:rFonts w:cs="Calibri"/>
-                <w:color w:val="000000" w:themeColor="text1"/>
-                <w:sz w:val="26"/>
-                <w:szCs w:val="26"/>
-                <w:lang w:bidi="ar-DZ"/>
-              </w:rPr>
-              <w:t>نظرة</w:t>
-            </w:r>
-            <w:proofErr w:type="spellEnd"/>
           </w:p>
         </w:tc>
       </w:tr>
@@ -3855,7 +2806,6 @@
                 <w:lang w:bidi="ar-DZ"/>
               </w:rPr>
             </w:pPr>
-            <w:proofErr w:type="spellStart"/>
             <w:r>
               <w:rPr>
                 <w:rFonts w:cs="Calibri"/>
@@ -3864,53 +2814,8 @@
                 <w:szCs w:val="26"/>
                 <w:lang w:bidi="ar-DZ"/>
               </w:rPr>
-              <w:t>يستغرق</w:t>
+              <w:t>يستغرق وقت لكي</w:t>
             </w:r>
-            <w:proofErr w:type="spellEnd"/>
-            <w:r>
-              <w:rPr>
-                <w:rFonts w:cs="Calibri"/>
-                <w:color w:val="000000" w:themeColor="text1"/>
-                <w:sz w:val="26"/>
-                <w:szCs w:val="26"/>
-                <w:lang w:bidi="ar-DZ"/>
-              </w:rPr>
-              <w:t xml:space="preserve"> </w:t>
-            </w:r>
-            <w:proofErr w:type="spellStart"/>
-            <w:r>
-              <w:rPr>
-                <w:rFonts w:cs="Calibri"/>
-                <w:color w:val="000000" w:themeColor="text1"/>
-                <w:sz w:val="26"/>
-                <w:szCs w:val="26"/>
-                <w:lang w:bidi="ar-DZ"/>
-              </w:rPr>
-              <w:t>وقت</w:t>
-            </w:r>
-            <w:proofErr w:type="spellEnd"/>
-            <w:r>
-              <w:rPr>
-                <w:rFonts w:cs="Calibri"/>
-                <w:color w:val="000000" w:themeColor="text1"/>
-                <w:sz w:val="26"/>
-                <w:szCs w:val="26"/>
-                <w:lang w:bidi="ar-DZ"/>
-              </w:rPr>
-              <w:t xml:space="preserve"> </w:t>
-            </w:r>
-            <w:proofErr w:type="spellStart"/>
-            <w:r>
-              <w:rPr>
-                <w:rFonts w:cs="Calibri"/>
-                <w:color w:val="000000" w:themeColor="text1"/>
-                <w:sz w:val="26"/>
-                <w:szCs w:val="26"/>
-                <w:lang w:bidi="ar-DZ"/>
-              </w:rPr>
-              <w:t>لكي</w:t>
-            </w:r>
-            <w:proofErr w:type="spellEnd"/>
           </w:p>
         </w:tc>
         <w:tc>
@@ -3966,7 +2871,6 @@
                 <w:lang w:bidi="ar-DZ"/>
               </w:rPr>
             </w:pPr>
-            <w:proofErr w:type="spellStart"/>
             <w:r>
               <w:rPr>
                 <w:rFonts w:cs="Calibri"/>
@@ -3975,31 +2879,8 @@
                 <w:szCs w:val="26"/>
                 <w:lang w:bidi="ar-DZ"/>
               </w:rPr>
-              <w:t>يقول</w:t>
+              <w:t>يقول الصدق</w:t>
             </w:r>
-            <w:proofErr w:type="spellEnd"/>
-            <w:r>
-              <w:rPr>
-                <w:rFonts w:cs="Calibri"/>
-                <w:color w:val="000000" w:themeColor="text1"/>
-                <w:sz w:val="26"/>
-                <w:szCs w:val="26"/>
-                <w:lang w:bidi="ar-DZ"/>
-              </w:rPr>
-              <w:t xml:space="preserve"> </w:t>
-            </w:r>
-            <w:proofErr w:type="spellStart"/>
-            <w:r>
-              <w:rPr>
-                <w:rFonts w:cs="Calibri"/>
-                <w:color w:val="000000" w:themeColor="text1"/>
-                <w:sz w:val="26"/>
-                <w:szCs w:val="26"/>
-                <w:lang w:bidi="ar-DZ"/>
-              </w:rPr>
-              <w:t>الصدق</w:t>
-            </w:r>
-            <w:proofErr w:type="spellEnd"/>
           </w:p>
         </w:tc>
       </w:tr>
@@ -4069,7 +2950,6 @@
                 <w:lang w:bidi="ar-DZ"/>
               </w:rPr>
             </w:pPr>
-            <w:proofErr w:type="spellStart"/>
             <w:r>
               <w:rPr>
                 <w:rFonts w:cs="Calibri"/>
@@ -4078,31 +2958,8 @@
                 <w:szCs w:val="26"/>
                 <w:lang w:bidi="ar-DZ"/>
               </w:rPr>
-              <w:t>خلاصة</w:t>
+              <w:t>خلاصة القول</w:t>
             </w:r>
-            <w:proofErr w:type="spellEnd"/>
-            <w:r>
-              <w:rPr>
-                <w:rFonts w:cs="Calibri"/>
-                <w:color w:val="000000" w:themeColor="text1"/>
-                <w:sz w:val="26"/>
-                <w:szCs w:val="26"/>
-                <w:lang w:bidi="ar-DZ"/>
-              </w:rPr>
-              <w:t xml:space="preserve"> </w:t>
-            </w:r>
-            <w:proofErr w:type="spellStart"/>
-            <w:r>
-              <w:rPr>
-                <w:rFonts w:cs="Calibri"/>
-                <w:color w:val="000000" w:themeColor="text1"/>
-                <w:sz w:val="26"/>
-                <w:szCs w:val="26"/>
-                <w:lang w:bidi="ar-DZ"/>
-              </w:rPr>
-              <w:t>القول</w:t>
-            </w:r>
-            <w:proofErr w:type="spellEnd"/>
           </w:p>
         </w:tc>
         <w:tc>
@@ -4184,7 +3041,6 @@
                 <w:lang w:bidi="ar-DZ"/>
               </w:rPr>
             </w:pPr>
-            <w:proofErr w:type="spellStart"/>
             <w:r>
               <w:rPr>
                 <w:rFonts w:cs="Calibri"/>
@@ -4193,31 +3049,8 @@
                 <w:szCs w:val="26"/>
                 <w:lang w:bidi="ar-DZ"/>
               </w:rPr>
-              <w:t>نبرة</w:t>
+              <w:t>نبرة الصوت</w:t>
             </w:r>
-            <w:proofErr w:type="spellEnd"/>
-            <w:r>
-              <w:rPr>
-                <w:rFonts w:cs="Calibri"/>
-                <w:color w:val="000000" w:themeColor="text1"/>
-                <w:sz w:val="26"/>
-                <w:szCs w:val="26"/>
-                <w:lang w:bidi="ar-DZ"/>
-              </w:rPr>
-              <w:t xml:space="preserve"> </w:t>
-            </w:r>
-            <w:proofErr w:type="spellStart"/>
-            <w:r>
-              <w:rPr>
-                <w:rFonts w:cs="Calibri"/>
-                <w:color w:val="000000" w:themeColor="text1"/>
-                <w:sz w:val="26"/>
-                <w:szCs w:val="26"/>
-                <w:lang w:bidi="ar-DZ"/>
-              </w:rPr>
-              <w:t>الصوت</w:t>
-            </w:r>
-            <w:proofErr w:type="spellEnd"/>
           </w:p>
         </w:tc>
       </w:tr>
@@ -4287,7 +3120,6 @@
                 <w:lang w:bidi="ar-DZ"/>
               </w:rPr>
             </w:pPr>
-            <w:proofErr w:type="spellStart"/>
             <w:r>
               <w:rPr>
                 <w:rFonts w:cs="Calibri"/>
@@ -4296,31 +3128,8 @@
                 <w:szCs w:val="26"/>
                 <w:lang w:bidi="ar-DZ"/>
               </w:rPr>
-              <w:t>يقلب</w:t>
+              <w:t>يقلب الصفحات</w:t>
             </w:r>
-            <w:proofErr w:type="spellEnd"/>
-            <w:r>
-              <w:rPr>
-                <w:rFonts w:cs="Calibri"/>
-                <w:color w:val="000000" w:themeColor="text1"/>
-                <w:sz w:val="26"/>
-                <w:szCs w:val="26"/>
-                <w:lang w:bidi="ar-DZ"/>
-              </w:rPr>
-              <w:t xml:space="preserve"> </w:t>
-            </w:r>
-            <w:proofErr w:type="spellStart"/>
-            <w:r>
-              <w:rPr>
-                <w:rFonts w:cs="Calibri"/>
-                <w:color w:val="000000" w:themeColor="text1"/>
-                <w:sz w:val="26"/>
-                <w:szCs w:val="26"/>
-                <w:lang w:bidi="ar-DZ"/>
-              </w:rPr>
-              <w:t>الصفحات</w:t>
-            </w:r>
-            <w:proofErr w:type="spellEnd"/>
           </w:p>
         </w:tc>
         <w:tc>
@@ -4376,7 +3185,6 @@
                 <w:lang w:bidi="ar-DZ"/>
               </w:rPr>
             </w:pPr>
-            <w:proofErr w:type="spellStart"/>
             <w:r>
               <w:rPr>
                 <w:rFonts w:cs="Calibri"/>
@@ -4385,1568 +3193,12 @@
                 <w:szCs w:val="26"/>
                 <w:lang w:bidi="ar-DZ"/>
               </w:rPr>
-              <w:t>يعبر</w:t>
+              <w:t>يعبر عن الندم</w:t>
             </w:r>
-            <w:proofErr w:type="spellEnd"/>
-            <w:r>
-              <w:rPr>
-                <w:rFonts w:cs="Calibri"/>
-                <w:color w:val="000000" w:themeColor="text1"/>
-                <w:sz w:val="26"/>
-                <w:szCs w:val="26"/>
-                <w:lang w:bidi="ar-DZ"/>
-              </w:rPr>
-              <w:t xml:space="preserve"> </w:t>
-            </w:r>
-            <w:proofErr w:type="spellStart"/>
-            <w:r>
-              <w:rPr>
-                <w:rFonts w:cs="Calibri"/>
-                <w:color w:val="000000" w:themeColor="text1"/>
-                <w:sz w:val="26"/>
-                <w:szCs w:val="26"/>
-                <w:lang w:bidi="ar-DZ"/>
-              </w:rPr>
-              <w:t>عن</w:t>
-            </w:r>
-            <w:proofErr w:type="spellEnd"/>
-            <w:r>
-              <w:rPr>
-                <w:rFonts w:cs="Calibri"/>
-                <w:color w:val="000000" w:themeColor="text1"/>
-                <w:sz w:val="26"/>
-                <w:szCs w:val="26"/>
-                <w:lang w:bidi="ar-DZ"/>
-              </w:rPr>
-              <w:t xml:space="preserve"> </w:t>
-            </w:r>
-            <w:proofErr w:type="spellStart"/>
-            <w:r>
-              <w:rPr>
-                <w:rFonts w:cs="Calibri"/>
-                <w:color w:val="000000" w:themeColor="text1"/>
-                <w:sz w:val="26"/>
-                <w:szCs w:val="26"/>
-                <w:lang w:bidi="ar-DZ"/>
-              </w:rPr>
-              <w:t>الندم</w:t>
-            </w:r>
-            <w:proofErr w:type="spellEnd"/>
           </w:p>
         </w:tc>
       </w:tr>
-    </w:tbl>
-    <w:p/>
-    <w:tbl>
-      <w:tblPr>
-        <w:tblStyle w:val="TableGrid"/>
-        <w:tblW w:w="0" w:type="auto"/>
-        <w:tblBorders>
-          <w:top w:val="double" w:sz="4" w:space="0" w:color="auto"/>
-          <w:left w:val="double" w:sz="4" w:space="0" w:color="auto"/>
-          <w:bottom w:val="double" w:sz="4" w:space="0" w:color="auto"/>
-          <w:right w:val="double" w:sz="4" w:space="0" w:color="auto"/>
-          <w:insideH w:val="dotted" w:sz="4" w:space="0" w:color="auto"/>
-          <w:insideV w:val="dotted" w:sz="4" w:space="0" w:color="auto"/>
-        </w:tblBorders>
-        <w:tblLook w:val="04A0" w:firstRow="1" w:lastRow="0" w:firstColumn="1" w:lastColumn="0" w:noHBand="0" w:noVBand="1"/>
-      </w:tblPr>
-      <w:tblGrid>
-        <w:gridCol w:w="2023"/>
-        <w:gridCol w:w="1546"/>
-        <w:gridCol w:w="1783"/>
-        <w:gridCol w:w="1593"/>
-        <w:gridCol w:w="2057"/>
-        <w:gridCol w:w="1564"/>
-      </w:tblGrid>
-      <w:tr>
-        <w:trPr>
-          <w:trHeight w:val="432"/>
-        </w:trPr>
-        <w:tc>
-          <w:tcPr>
-            <w:tcW w:w="2023" w:type="dxa"/>
-            <w:tcBorders>
-              <w:top w:val="double" w:sz="4" w:space="0" w:color="auto"/>
-              <w:bottom w:val="dotted" w:sz="4" w:space="0" w:color="auto"/>
-              <w:right w:val="nil"/>
-            </w:tcBorders>
-            <w:shd w:val="clear" w:color="auto" w:fill="000000" w:themeFill="text1"/>
-            <w:vAlign w:val="center"/>
-          </w:tcPr>
-          <w:p>
-            <w:pPr>
-              <w:jc w:val="center"/>
-              <w:rPr>
-                <w:b/>
-                <w:bCs/>
-                <w:sz w:val="32"/>
-                <w:szCs w:val="24"/>
-              </w:rPr>
-            </w:pPr>
-            <w:r>
-              <w:rPr>
-                <w:rFonts w:ascii="Calibri" w:hAnsi="Calibri"/>
-                <w:b/>
-                <w:bCs/>
-                <w:sz w:val="32"/>
-                <w:szCs w:val="24"/>
-              </w:rPr>
-              <w:t>Word</w:t>
-            </w:r>
-          </w:p>
-        </w:tc>
-        <w:tc>
-          <w:tcPr>
-            <w:tcW w:w="1546" w:type="dxa"/>
-            <w:tcBorders>
-              <w:top w:val="double" w:sz="4" w:space="0" w:color="auto"/>
-              <w:left w:val="nil"/>
-              <w:bottom w:val="dotted" w:sz="4" w:space="0" w:color="auto"/>
-            </w:tcBorders>
-            <w:shd w:val="clear" w:color="auto" w:fill="000000" w:themeFill="text1"/>
-            <w:vAlign w:val="center"/>
-          </w:tcPr>
-          <w:p>
-            <w:pPr>
-              <w:bidi/>
-              <w:jc w:val="center"/>
-              <w:rPr>
-                <w:b/>
-                <w:bCs/>
-                <w:sz w:val="32"/>
-                <w:szCs w:val="24"/>
-              </w:rPr>
-            </w:pPr>
-            <w:proofErr w:type="spellStart"/>
-            <w:r>
-              <w:rPr>
-                <w:rFonts w:ascii="Calibri" w:hAnsi="Calibri"/>
-                <w:b/>
-                <w:bCs/>
-                <w:sz w:val="32"/>
-                <w:szCs w:val="24"/>
-              </w:rPr>
-              <w:t>الكلمة</w:t>
-            </w:r>
-            <w:proofErr w:type="spellEnd"/>
-          </w:p>
-        </w:tc>
-        <w:tc>
-          <w:tcPr>
-            <w:tcW w:w="1783" w:type="dxa"/>
-            <w:tcBorders>
-              <w:top w:val="double" w:sz="4" w:space="0" w:color="auto"/>
-              <w:bottom w:val="dotted" w:sz="4" w:space="0" w:color="auto"/>
-              <w:right w:val="nil"/>
-            </w:tcBorders>
-            <w:shd w:val="clear" w:color="auto" w:fill="000000" w:themeFill="text1"/>
-            <w:vAlign w:val="center"/>
-          </w:tcPr>
-          <w:p>
-            <w:pPr>
-              <w:jc w:val="center"/>
-              <w:rPr>
-                <w:b/>
-                <w:bCs/>
-                <w:sz w:val="32"/>
-                <w:szCs w:val="24"/>
-              </w:rPr>
-            </w:pPr>
-            <w:r>
-              <w:rPr>
-                <w:rFonts w:ascii="Calibri" w:hAnsi="Calibri"/>
-                <w:b/>
-                <w:bCs/>
-                <w:sz w:val="32"/>
-                <w:szCs w:val="24"/>
-              </w:rPr>
-              <w:t>Synonym</w:t>
-            </w:r>
-          </w:p>
-        </w:tc>
-        <w:tc>
-          <w:tcPr>
-            <w:tcW w:w="1593" w:type="dxa"/>
-            <w:tcBorders>
-              <w:top w:val="double" w:sz="4" w:space="0" w:color="auto"/>
-              <w:left w:val="nil"/>
-              <w:bottom w:val="dotted" w:sz="4" w:space="0" w:color="auto"/>
-            </w:tcBorders>
-            <w:shd w:val="clear" w:color="auto" w:fill="000000" w:themeFill="text1"/>
-            <w:vAlign w:val="center"/>
-          </w:tcPr>
-          <w:p>
-            <w:pPr>
-              <w:bidi/>
-              <w:jc w:val="center"/>
-              <w:rPr>
-                <w:b/>
-                <w:bCs/>
-                <w:sz w:val="32"/>
-                <w:szCs w:val="24"/>
-              </w:rPr>
-            </w:pPr>
-            <w:proofErr w:type="spellStart"/>
-            <w:r>
-              <w:rPr>
-                <w:rFonts w:ascii="Calibri" w:hAnsi="Calibri"/>
-                <w:b/>
-                <w:bCs/>
-                <w:sz w:val="32"/>
-                <w:szCs w:val="24"/>
-              </w:rPr>
-              <w:t>المرادف</w:t>
-            </w:r>
-            <w:proofErr w:type="spellEnd"/>
-          </w:p>
-        </w:tc>
-        <w:tc>
-          <w:tcPr>
-            <w:tcW w:w="2057" w:type="dxa"/>
-            <w:tcBorders>
-              <w:top w:val="double" w:sz="4" w:space="0" w:color="auto"/>
-              <w:bottom w:val="dotted" w:sz="4" w:space="0" w:color="auto"/>
-              <w:right w:val="nil"/>
-            </w:tcBorders>
-            <w:shd w:val="clear" w:color="auto" w:fill="000000" w:themeFill="text1"/>
-            <w:vAlign w:val="center"/>
-          </w:tcPr>
-          <w:p>
-            <w:pPr>
-              <w:jc w:val="center"/>
-              <w:rPr>
-                <w:b/>
-                <w:bCs/>
-                <w:sz w:val="32"/>
-                <w:szCs w:val="24"/>
-              </w:rPr>
-            </w:pPr>
-            <w:r>
-              <w:rPr>
-                <w:rFonts w:ascii="Calibri" w:hAnsi="Calibri"/>
-                <w:b/>
-                <w:bCs/>
-                <w:sz w:val="32"/>
-                <w:szCs w:val="24"/>
-              </w:rPr>
-              <w:t>Antonym</w:t>
-            </w:r>
-          </w:p>
-        </w:tc>
-        <w:tc>
-          <w:tcPr>
-            <w:tcW w:w="1564" w:type="dxa"/>
-            <w:tcBorders>
-              <w:top w:val="double" w:sz="4" w:space="0" w:color="auto"/>
-              <w:left w:val="nil"/>
-              <w:bottom w:val="dotted" w:sz="4" w:space="0" w:color="auto"/>
-            </w:tcBorders>
-            <w:shd w:val="clear" w:color="auto" w:fill="000000" w:themeFill="text1"/>
-            <w:vAlign w:val="center"/>
-          </w:tcPr>
-          <w:p>
-            <w:pPr>
-              <w:bidi/>
-              <w:jc w:val="center"/>
-              <w:rPr>
-                <w:b/>
-                <w:bCs/>
-                <w:sz w:val="32"/>
-                <w:szCs w:val="24"/>
-              </w:rPr>
-            </w:pPr>
-            <w:proofErr w:type="spellStart"/>
-            <w:r>
-              <w:rPr>
-                <w:rFonts w:ascii="Calibri" w:hAnsi="Calibri"/>
-                <w:b/>
-                <w:bCs/>
-                <w:sz w:val="32"/>
-                <w:szCs w:val="24"/>
-              </w:rPr>
-              <w:t>المضاد</w:t>
-            </w:r>
-            <w:proofErr w:type="spellEnd"/>
-          </w:p>
-        </w:tc>
-      </w:tr>
-      <w:tr>
-        <w:trPr>
-          <w:trHeight w:val="432"/>
-        </w:trPr>
-        <w:tc>
-          <w:tcPr>
-            <w:tcW w:w="2023" w:type="dxa"/>
-            <w:tcBorders>
-              <w:top w:val="dotted" w:sz="4" w:space="0" w:color="auto"/>
-              <w:bottom w:val="dotted" w:sz="4" w:space="0" w:color="auto"/>
-              <w:right w:val="nil"/>
-            </w:tcBorders>
-            <w:vAlign w:val="center"/>
-          </w:tcPr>
-          <w:p>
-            <w:r>
-              <w:rPr>
-                <w:rFonts w:ascii="Calibri" w:hAnsi="Calibri"/>
-                <w:sz w:val="28"/>
-              </w:rPr>
-              <w:t>care</w:t>
-            </w:r>
-          </w:p>
-        </w:tc>
-        <w:tc>
-          <w:tcPr>
-            <w:tcW w:w="1546" w:type="dxa"/>
-            <w:tcBorders>
-              <w:top w:val="dotted" w:sz="4" w:space="0" w:color="auto"/>
-              <w:left w:val="nil"/>
-              <w:bottom w:val="dotted" w:sz="4" w:space="0" w:color="auto"/>
-            </w:tcBorders>
-            <w:vAlign w:val="center"/>
-          </w:tcPr>
-          <w:p>
-            <w:pPr>
-              <w:pStyle w:val="NoSpacing"/>
-              <w:bidi/>
-              <w:spacing w:line="276" w:lineRule="auto"/>
-              <w:rPr>
-                <w:rFonts w:eastAsiaTheme="minorHAnsi" w:cs="Calibri"/>
-                <w:color w:val="000000" w:themeColor="text1"/>
-                <w:sz w:val="26"/>
-                <w:szCs w:val="26"/>
-                <w:lang w:bidi="ar-DZ"/>
-              </w:rPr>
-            </w:pPr>
-            <w:proofErr w:type="spellStart"/>
-            <w:r>
-              <w:rPr>
-                <w:rFonts w:eastAsiaTheme="minorHAnsi" w:cs="Calibri"/>
-                <w:color w:val="000000" w:themeColor="text1"/>
-                <w:sz w:val="26"/>
-                <w:szCs w:val="26"/>
-                <w:lang w:bidi="ar-DZ"/>
-              </w:rPr>
-              <w:t>يهتم</w:t>
-            </w:r>
-            <w:proofErr w:type="spellEnd"/>
-          </w:p>
-        </w:tc>
-        <w:tc>
-          <w:tcPr>
-            <w:tcW w:w="1783" w:type="dxa"/>
-            <w:tcBorders>
-              <w:top w:val="dotted" w:sz="4" w:space="0" w:color="auto"/>
-              <w:bottom w:val="dotted" w:sz="4" w:space="0" w:color="auto"/>
-              <w:right w:val="nil"/>
-            </w:tcBorders>
-            <w:vAlign w:val="center"/>
-          </w:tcPr>
-          <w:p>
-            <w:r>
-              <w:rPr>
-                <w:rFonts w:ascii="Calibri" w:hAnsi="Calibri"/>
-                <w:sz w:val="28"/>
-              </w:rPr>
-              <w:t>concern</w:t>
-            </w:r>
-            <w:r>
-              <w:rPr>
-                <w:rFonts w:ascii="Calibri" w:hAnsi="Calibri"/>
-                <w:sz w:val="28"/>
-              </w:rPr>
-              <w:br/>
-              <w:t>regard</w:t>
-            </w:r>
-          </w:p>
-        </w:tc>
-        <w:tc>
-          <w:tcPr>
-            <w:tcW w:w="1593" w:type="dxa"/>
-            <w:tcBorders>
-              <w:top w:val="dotted" w:sz="4" w:space="0" w:color="auto"/>
-              <w:left w:val="nil"/>
-              <w:bottom w:val="dotted" w:sz="4" w:space="0" w:color="auto"/>
-            </w:tcBorders>
-            <w:vAlign w:val="center"/>
-          </w:tcPr>
-          <w:p>
-            <w:pPr>
-              <w:pStyle w:val="NoSpacing"/>
-              <w:bidi/>
-              <w:spacing w:line="276" w:lineRule="auto"/>
-              <w:rPr>
-                <w:rFonts w:eastAsiaTheme="minorHAnsi" w:cs="Calibri"/>
-                <w:color w:val="000000" w:themeColor="text1"/>
-                <w:sz w:val="26"/>
-                <w:szCs w:val="26"/>
-                <w:lang w:bidi="ar-DZ"/>
-              </w:rPr>
-            </w:pPr>
-            <w:proofErr w:type="spellStart"/>
-            <w:r>
-              <w:rPr>
-                <w:rFonts w:eastAsiaTheme="minorHAnsi" w:cs="Calibri"/>
-                <w:color w:val="000000" w:themeColor="text1"/>
-                <w:sz w:val="26"/>
-                <w:szCs w:val="26"/>
-                <w:lang w:bidi="ar-DZ"/>
-              </w:rPr>
-              <w:t>اهتمام</w:t>
-            </w:r>
-            <w:proofErr w:type="spellEnd"/>
-            <w:r>
-              <w:rPr>
-                <w:rFonts w:eastAsiaTheme="minorHAnsi" w:cs="Calibri"/>
-                <w:color w:val="000000" w:themeColor="text1"/>
-                <w:sz w:val="26"/>
-                <w:szCs w:val="26"/>
-                <w:lang w:bidi="ar-DZ"/>
-              </w:rPr>
-              <w:br/>
-            </w:r>
-            <w:proofErr w:type="spellStart"/>
-            <w:r>
-              <w:rPr>
-                <w:rFonts w:eastAsiaTheme="minorHAnsi" w:cs="Calibri"/>
-                <w:color w:val="000000" w:themeColor="text1"/>
-                <w:sz w:val="26"/>
-                <w:szCs w:val="26"/>
-                <w:lang w:bidi="ar-DZ"/>
-              </w:rPr>
-              <w:t>اعتبار</w:t>
-            </w:r>
-            <w:proofErr w:type="spellEnd"/>
-          </w:p>
-        </w:tc>
-        <w:tc>
-          <w:tcPr>
-            <w:tcW w:w="2057" w:type="dxa"/>
-            <w:tcBorders>
-              <w:top w:val="dotted" w:sz="4" w:space="0" w:color="auto"/>
-              <w:bottom w:val="dotted" w:sz="4" w:space="0" w:color="auto"/>
-              <w:right w:val="nil"/>
-            </w:tcBorders>
-            <w:vAlign w:val="center"/>
-          </w:tcPr>
-          <w:p>
-            <w:r>
-              <w:rPr>
-                <w:rFonts w:ascii="Calibri" w:hAnsi="Calibri"/>
-                <w:sz w:val="28"/>
-              </w:rPr>
-              <w:t>ignore</w:t>
-            </w:r>
-          </w:p>
-        </w:tc>
-        <w:tc>
-          <w:tcPr>
-            <w:tcW w:w="1564" w:type="dxa"/>
-            <w:tcBorders>
-              <w:top w:val="dotted" w:sz="4" w:space="0" w:color="auto"/>
-              <w:left w:val="nil"/>
-              <w:bottom w:val="dotted" w:sz="4" w:space="0" w:color="auto"/>
-            </w:tcBorders>
-            <w:vAlign w:val="center"/>
-          </w:tcPr>
-          <w:p>
-            <w:pPr>
-              <w:pStyle w:val="NoSpacing"/>
-              <w:bidi/>
-              <w:spacing w:line="276" w:lineRule="auto"/>
-              <w:rPr>
-                <w:rFonts w:eastAsiaTheme="minorHAnsi" w:cs="Calibri"/>
-                <w:color w:val="000000" w:themeColor="text1"/>
-                <w:sz w:val="26"/>
-                <w:szCs w:val="26"/>
-                <w:lang w:bidi="ar-DZ"/>
-              </w:rPr>
-            </w:pPr>
-            <w:proofErr w:type="spellStart"/>
-            <w:r>
-              <w:rPr>
-                <w:rFonts w:eastAsiaTheme="minorHAnsi" w:cs="Calibri"/>
-                <w:color w:val="000000" w:themeColor="text1"/>
-                <w:sz w:val="26"/>
-                <w:szCs w:val="26"/>
-                <w:lang w:bidi="ar-DZ"/>
-              </w:rPr>
-              <w:t>يتجاهل</w:t>
-            </w:r>
-            <w:proofErr w:type="spellEnd"/>
-          </w:p>
-        </w:tc>
-      </w:tr>
-      <w:tr>
-        <w:trPr>
-          <w:trHeight w:val="432"/>
-        </w:trPr>
-        <w:tc>
-          <w:tcPr>
-            <w:tcW w:w="2023" w:type="dxa"/>
-            <w:tcBorders>
-              <w:top w:val="dotted" w:sz="4" w:space="0" w:color="auto"/>
-              <w:bottom w:val="dotted" w:sz="4" w:space="0" w:color="auto"/>
-              <w:right w:val="nil"/>
-            </w:tcBorders>
-            <w:shd w:val="clear" w:color="auto" w:fill="FFFFCC"/>
-            <w:vAlign w:val="center"/>
-          </w:tcPr>
-          <w:p>
-            <w:r>
-              <w:rPr>
-                <w:rFonts w:ascii="Calibri" w:hAnsi="Calibri"/>
-                <w:sz w:val="28"/>
-              </w:rPr>
-              <w:t>stay in touch</w:t>
-            </w:r>
-          </w:p>
-        </w:tc>
-        <w:tc>
-          <w:tcPr>
-            <w:tcW w:w="1546" w:type="dxa"/>
-            <w:tcBorders>
-              <w:top w:val="dotted" w:sz="4" w:space="0" w:color="auto"/>
-              <w:left w:val="nil"/>
-              <w:bottom w:val="dotted" w:sz="4" w:space="0" w:color="auto"/>
-            </w:tcBorders>
-            <w:shd w:val="clear" w:color="auto" w:fill="FFFFCC"/>
-            <w:vAlign w:val="center"/>
-          </w:tcPr>
-          <w:p>
-            <w:pPr>
-              <w:pStyle w:val="NoSpacing"/>
-              <w:bidi/>
-              <w:spacing w:line="276" w:lineRule="auto"/>
-              <w:rPr>
-                <w:rFonts w:eastAsiaTheme="minorHAnsi" w:cs="Calibri"/>
-                <w:color w:val="000000" w:themeColor="text1"/>
-                <w:sz w:val="26"/>
-                <w:szCs w:val="26"/>
-                <w:lang w:bidi="ar-DZ"/>
-              </w:rPr>
-            </w:pPr>
-            <w:proofErr w:type="spellStart"/>
-            <w:r>
-              <w:rPr>
-                <w:rFonts w:eastAsiaTheme="minorHAnsi" w:cs="Calibri"/>
-                <w:color w:val="000000" w:themeColor="text1"/>
-                <w:sz w:val="26"/>
-                <w:szCs w:val="26"/>
-                <w:lang w:bidi="ar-DZ"/>
-              </w:rPr>
-              <w:t>يظل</w:t>
-            </w:r>
-            <w:proofErr w:type="spellEnd"/>
-            <w:r>
-              <w:rPr>
-                <w:rFonts w:eastAsiaTheme="minorHAnsi" w:cs="Calibri"/>
-                <w:color w:val="000000" w:themeColor="text1"/>
-                <w:sz w:val="26"/>
-                <w:szCs w:val="26"/>
-                <w:lang w:bidi="ar-DZ"/>
-              </w:rPr>
-              <w:t xml:space="preserve"> </w:t>
-            </w:r>
-            <w:proofErr w:type="spellStart"/>
-            <w:r>
-              <w:rPr>
-                <w:rFonts w:eastAsiaTheme="minorHAnsi" w:cs="Calibri"/>
-                <w:color w:val="000000" w:themeColor="text1"/>
-                <w:sz w:val="26"/>
-                <w:szCs w:val="26"/>
-                <w:lang w:bidi="ar-DZ"/>
-              </w:rPr>
-              <w:t>على</w:t>
-            </w:r>
-            <w:proofErr w:type="spellEnd"/>
-            <w:r>
-              <w:rPr>
-                <w:rFonts w:eastAsiaTheme="minorHAnsi" w:cs="Calibri"/>
-                <w:color w:val="000000" w:themeColor="text1"/>
-                <w:sz w:val="26"/>
-                <w:szCs w:val="26"/>
-                <w:lang w:bidi="ar-DZ"/>
-              </w:rPr>
-              <w:t xml:space="preserve"> </w:t>
-            </w:r>
-            <w:proofErr w:type="spellStart"/>
-            <w:r>
-              <w:rPr>
-                <w:rFonts w:eastAsiaTheme="minorHAnsi" w:cs="Calibri"/>
-                <w:color w:val="000000" w:themeColor="text1"/>
-                <w:sz w:val="26"/>
-                <w:szCs w:val="26"/>
-                <w:lang w:bidi="ar-DZ"/>
-              </w:rPr>
-              <w:t>اتصال</w:t>
-            </w:r>
-            <w:proofErr w:type="spellEnd"/>
-          </w:p>
-        </w:tc>
-        <w:tc>
-          <w:tcPr>
-            <w:tcW w:w="1783" w:type="dxa"/>
-            <w:tcBorders>
-              <w:top w:val="dotted" w:sz="4" w:space="0" w:color="auto"/>
-              <w:bottom w:val="dotted" w:sz="4" w:space="0" w:color="auto"/>
-              <w:right w:val="nil"/>
-            </w:tcBorders>
-            <w:shd w:val="clear" w:color="auto" w:fill="FFFFCC"/>
-            <w:vAlign w:val="center"/>
-          </w:tcPr>
-          <w:p>
-            <w:r>
-              <w:rPr>
-                <w:rFonts w:ascii="Calibri" w:hAnsi="Calibri"/>
-                <w:sz w:val="28"/>
-              </w:rPr>
-              <w:t>keep in touch</w:t>
-            </w:r>
-          </w:p>
-        </w:tc>
-        <w:tc>
-          <w:tcPr>
-            <w:tcW w:w="1593" w:type="dxa"/>
-            <w:tcBorders>
-              <w:top w:val="dotted" w:sz="4" w:space="0" w:color="auto"/>
-              <w:left w:val="nil"/>
-              <w:bottom w:val="dotted" w:sz="4" w:space="0" w:color="auto"/>
-            </w:tcBorders>
-            <w:shd w:val="clear" w:color="auto" w:fill="FFFFCC"/>
-            <w:vAlign w:val="center"/>
-          </w:tcPr>
-          <w:p>
-            <w:pPr>
-              <w:pStyle w:val="NoSpacing"/>
-              <w:bidi/>
-              <w:spacing w:line="276" w:lineRule="auto"/>
-              <w:rPr>
-                <w:rFonts w:eastAsiaTheme="minorHAnsi" w:cs="Calibri"/>
-                <w:color w:val="000000" w:themeColor="text1"/>
-                <w:sz w:val="26"/>
-                <w:szCs w:val="26"/>
-                <w:lang w:bidi="ar-DZ"/>
-              </w:rPr>
-            </w:pPr>
-            <w:proofErr w:type="spellStart"/>
-            <w:r>
-              <w:rPr>
-                <w:rFonts w:eastAsiaTheme="minorHAnsi" w:cs="Calibri"/>
-                <w:color w:val="000000" w:themeColor="text1"/>
-                <w:sz w:val="26"/>
-                <w:szCs w:val="26"/>
-                <w:lang w:bidi="ar-DZ"/>
-              </w:rPr>
-              <w:t>يبقى</w:t>
-            </w:r>
-            <w:proofErr w:type="spellEnd"/>
-            <w:r>
-              <w:rPr>
-                <w:rFonts w:eastAsiaTheme="minorHAnsi" w:cs="Calibri"/>
-                <w:color w:val="000000" w:themeColor="text1"/>
-                <w:sz w:val="26"/>
-                <w:szCs w:val="26"/>
-                <w:lang w:bidi="ar-DZ"/>
-              </w:rPr>
-              <w:t xml:space="preserve"> </w:t>
-            </w:r>
-            <w:proofErr w:type="spellStart"/>
-            <w:r>
-              <w:rPr>
-                <w:rFonts w:eastAsiaTheme="minorHAnsi" w:cs="Calibri"/>
-                <w:color w:val="000000" w:themeColor="text1"/>
-                <w:sz w:val="26"/>
-                <w:szCs w:val="26"/>
-                <w:lang w:bidi="ar-DZ"/>
-              </w:rPr>
-              <w:t>على</w:t>
-            </w:r>
-            <w:proofErr w:type="spellEnd"/>
-            <w:r>
-              <w:rPr>
-                <w:rFonts w:eastAsiaTheme="minorHAnsi" w:cs="Calibri"/>
-                <w:color w:val="000000" w:themeColor="text1"/>
-                <w:sz w:val="26"/>
-                <w:szCs w:val="26"/>
-                <w:lang w:bidi="ar-DZ"/>
-              </w:rPr>
-              <w:t xml:space="preserve"> </w:t>
-            </w:r>
-            <w:proofErr w:type="spellStart"/>
-            <w:r>
-              <w:rPr>
-                <w:rFonts w:eastAsiaTheme="minorHAnsi" w:cs="Calibri"/>
-                <w:color w:val="000000" w:themeColor="text1"/>
-                <w:sz w:val="26"/>
-                <w:szCs w:val="26"/>
-                <w:lang w:bidi="ar-DZ"/>
-              </w:rPr>
-              <w:t>اتصال</w:t>
-            </w:r>
-            <w:proofErr w:type="spellEnd"/>
-          </w:p>
-        </w:tc>
-        <w:tc>
-          <w:tcPr>
-            <w:tcW w:w="2057" w:type="dxa"/>
-            <w:tcBorders>
-              <w:top w:val="dotted" w:sz="4" w:space="0" w:color="auto"/>
-              <w:bottom w:val="dotted" w:sz="4" w:space="0" w:color="auto"/>
-              <w:right w:val="nil"/>
-            </w:tcBorders>
-            <w:shd w:val="clear" w:color="auto" w:fill="FFFFCC"/>
-            <w:vAlign w:val="center"/>
-          </w:tcPr>
-          <w:p>
-            <w:r>
-              <w:rPr>
-                <w:rFonts w:ascii="Calibri" w:hAnsi="Calibri"/>
-                <w:sz w:val="28"/>
-              </w:rPr>
-              <w:t>lose touch with</w:t>
-            </w:r>
-          </w:p>
-        </w:tc>
-        <w:tc>
-          <w:tcPr>
-            <w:tcW w:w="1564" w:type="dxa"/>
-            <w:tcBorders>
-              <w:top w:val="dotted" w:sz="4" w:space="0" w:color="auto"/>
-              <w:left w:val="nil"/>
-              <w:bottom w:val="dotted" w:sz="4" w:space="0" w:color="auto"/>
-            </w:tcBorders>
-            <w:shd w:val="clear" w:color="auto" w:fill="FFFFCC"/>
-            <w:vAlign w:val="center"/>
-          </w:tcPr>
-          <w:p>
-            <w:pPr>
-              <w:pStyle w:val="NoSpacing"/>
-              <w:bidi/>
-              <w:spacing w:line="276" w:lineRule="auto"/>
-              <w:rPr>
-                <w:rFonts w:eastAsiaTheme="minorHAnsi" w:cs="Calibri"/>
-                <w:color w:val="000000" w:themeColor="text1"/>
-                <w:sz w:val="26"/>
-                <w:szCs w:val="26"/>
-                <w:lang w:bidi="ar-DZ"/>
-              </w:rPr>
-            </w:pPr>
-            <w:proofErr w:type="spellStart"/>
-            <w:r>
-              <w:rPr>
-                <w:rFonts w:eastAsiaTheme="minorHAnsi" w:cs="Calibri"/>
-                <w:color w:val="000000" w:themeColor="text1"/>
-                <w:sz w:val="26"/>
-                <w:szCs w:val="26"/>
-                <w:lang w:bidi="ar-DZ"/>
-              </w:rPr>
-              <w:t>يفقد</w:t>
-            </w:r>
-            <w:proofErr w:type="spellEnd"/>
-            <w:r>
-              <w:rPr>
-                <w:rFonts w:eastAsiaTheme="minorHAnsi" w:cs="Calibri"/>
-                <w:color w:val="000000" w:themeColor="text1"/>
-                <w:sz w:val="26"/>
-                <w:szCs w:val="26"/>
-                <w:lang w:bidi="ar-DZ"/>
-              </w:rPr>
-              <w:t xml:space="preserve"> </w:t>
-            </w:r>
-            <w:proofErr w:type="spellStart"/>
-            <w:r>
-              <w:rPr>
-                <w:rFonts w:eastAsiaTheme="minorHAnsi" w:cs="Calibri"/>
-                <w:color w:val="000000" w:themeColor="text1"/>
-                <w:sz w:val="26"/>
-                <w:szCs w:val="26"/>
-                <w:lang w:bidi="ar-DZ"/>
-              </w:rPr>
-              <w:t>التواصل</w:t>
-            </w:r>
-            <w:proofErr w:type="spellEnd"/>
-          </w:p>
-        </w:tc>
-      </w:tr>
-      <w:tr>
-        <w:trPr>
-          <w:trHeight w:val="432"/>
-        </w:trPr>
-        <w:tc>
-          <w:tcPr>
-            <w:tcW w:w="2023" w:type="dxa"/>
-            <w:tcBorders>
-              <w:top w:val="dotted" w:sz="4" w:space="0" w:color="auto"/>
-              <w:bottom w:val="dotted" w:sz="4" w:space="0" w:color="auto"/>
-              <w:right w:val="nil"/>
-            </w:tcBorders>
-            <w:vAlign w:val="center"/>
-          </w:tcPr>
-          <w:p>
-            <w:r>
-              <w:rPr>
-                <w:rFonts w:ascii="Calibri" w:hAnsi="Calibri"/>
-                <w:sz w:val="28"/>
-              </w:rPr>
-              <w:t>conflict</w:t>
-            </w:r>
-          </w:p>
-        </w:tc>
-        <w:tc>
-          <w:tcPr>
-            <w:tcW w:w="1546" w:type="dxa"/>
-            <w:tcBorders>
-              <w:top w:val="dotted" w:sz="4" w:space="0" w:color="auto"/>
-              <w:left w:val="nil"/>
-              <w:bottom w:val="dotted" w:sz="4" w:space="0" w:color="auto"/>
-            </w:tcBorders>
-            <w:vAlign w:val="center"/>
-          </w:tcPr>
-          <w:p>
-            <w:pPr>
-              <w:pStyle w:val="NoSpacing"/>
-              <w:bidi/>
-              <w:spacing w:line="276" w:lineRule="auto"/>
-              <w:rPr>
-                <w:rFonts w:eastAsiaTheme="minorHAnsi" w:cs="Calibri"/>
-                <w:color w:val="000000" w:themeColor="text1"/>
-                <w:sz w:val="26"/>
-                <w:szCs w:val="26"/>
-                <w:lang w:bidi="ar-DZ"/>
-              </w:rPr>
-            </w:pPr>
-            <w:proofErr w:type="spellStart"/>
-            <w:r>
-              <w:rPr>
-                <w:rFonts w:eastAsiaTheme="minorHAnsi" w:cs="Calibri"/>
-                <w:color w:val="000000" w:themeColor="text1"/>
-                <w:sz w:val="26"/>
-                <w:szCs w:val="26"/>
-                <w:lang w:bidi="ar-DZ"/>
-              </w:rPr>
-              <w:t>خلاف</w:t>
-            </w:r>
-            <w:proofErr w:type="spellEnd"/>
-            <w:r>
-              <w:rPr>
-                <w:rFonts w:eastAsiaTheme="minorHAnsi" w:cs="Calibri"/>
-                <w:color w:val="000000" w:themeColor="text1"/>
-                <w:sz w:val="26"/>
-                <w:szCs w:val="26"/>
-                <w:lang w:bidi="ar-DZ"/>
-              </w:rPr>
-              <w:br/>
-            </w:r>
-            <w:proofErr w:type="spellStart"/>
-            <w:r>
-              <w:rPr>
-                <w:rFonts w:eastAsiaTheme="minorHAnsi" w:cs="Calibri"/>
-                <w:color w:val="000000" w:themeColor="text1"/>
-                <w:sz w:val="26"/>
-                <w:szCs w:val="26"/>
-                <w:lang w:bidi="ar-DZ"/>
-              </w:rPr>
-              <w:t>صراع</w:t>
-            </w:r>
-            <w:proofErr w:type="spellEnd"/>
-          </w:p>
-        </w:tc>
-        <w:tc>
-          <w:tcPr>
-            <w:tcW w:w="1783" w:type="dxa"/>
-            <w:tcBorders>
-              <w:top w:val="dotted" w:sz="4" w:space="0" w:color="auto"/>
-              <w:bottom w:val="dotted" w:sz="4" w:space="0" w:color="auto"/>
-              <w:right w:val="nil"/>
-            </w:tcBorders>
-            <w:vAlign w:val="center"/>
-          </w:tcPr>
-          <w:p>
-            <w:r>
-              <w:rPr>
-                <w:rFonts w:ascii="Calibri" w:hAnsi="Calibri"/>
-                <w:sz w:val="28"/>
-              </w:rPr>
-              <w:t>disagreement</w:t>
-            </w:r>
-            <w:r>
-              <w:rPr>
-                <w:rFonts w:ascii="Calibri" w:hAnsi="Calibri"/>
-                <w:sz w:val="28"/>
-              </w:rPr>
-              <w:br/>
-              <w:t>argument</w:t>
-            </w:r>
-          </w:p>
-        </w:tc>
-        <w:tc>
-          <w:tcPr>
-            <w:tcW w:w="1593" w:type="dxa"/>
-            <w:tcBorders>
-              <w:top w:val="dotted" w:sz="4" w:space="0" w:color="auto"/>
-              <w:left w:val="nil"/>
-              <w:bottom w:val="dotted" w:sz="4" w:space="0" w:color="auto"/>
-            </w:tcBorders>
-            <w:vAlign w:val="center"/>
-          </w:tcPr>
-          <w:p>
-            <w:pPr>
-              <w:pStyle w:val="NoSpacing"/>
-              <w:bidi/>
-              <w:spacing w:line="276" w:lineRule="auto"/>
-              <w:rPr>
-                <w:rFonts w:eastAsiaTheme="minorHAnsi" w:cs="Calibri"/>
-                <w:color w:val="000000" w:themeColor="text1"/>
-                <w:sz w:val="26"/>
-                <w:szCs w:val="26"/>
-                <w:lang w:bidi="ar-DZ"/>
-              </w:rPr>
-            </w:pPr>
-            <w:proofErr w:type="spellStart"/>
-            <w:r>
-              <w:rPr>
-                <w:rFonts w:eastAsiaTheme="minorHAnsi" w:cs="Calibri"/>
-                <w:color w:val="000000" w:themeColor="text1"/>
-                <w:sz w:val="26"/>
-                <w:szCs w:val="26"/>
-                <w:lang w:bidi="ar-DZ"/>
-              </w:rPr>
-              <w:t>خلاف</w:t>
-            </w:r>
-            <w:proofErr w:type="spellEnd"/>
-            <w:r>
-              <w:rPr>
-                <w:rFonts w:eastAsiaTheme="minorHAnsi" w:cs="Calibri"/>
-                <w:color w:val="000000" w:themeColor="text1"/>
-                <w:sz w:val="26"/>
-                <w:szCs w:val="26"/>
-                <w:lang w:bidi="ar-DZ"/>
-              </w:rPr>
-              <w:br/>
-            </w:r>
-            <w:proofErr w:type="spellStart"/>
-            <w:r>
-              <w:rPr>
-                <w:rFonts w:eastAsiaTheme="minorHAnsi" w:cs="Calibri"/>
-                <w:color w:val="000000" w:themeColor="text1"/>
-                <w:sz w:val="26"/>
-                <w:szCs w:val="26"/>
-                <w:lang w:bidi="ar-DZ"/>
-              </w:rPr>
-              <w:t>جدال</w:t>
-            </w:r>
-            <w:proofErr w:type="spellEnd"/>
-          </w:p>
-        </w:tc>
-        <w:tc>
-          <w:tcPr>
-            <w:tcW w:w="2057" w:type="dxa"/>
-            <w:tcBorders>
-              <w:top w:val="dotted" w:sz="4" w:space="0" w:color="auto"/>
-              <w:bottom w:val="dotted" w:sz="4" w:space="0" w:color="auto"/>
-              <w:right w:val="nil"/>
-            </w:tcBorders>
-            <w:vAlign w:val="center"/>
-          </w:tcPr>
-          <w:p>
-            <w:r>
-              <w:rPr>
-                <w:rFonts w:ascii="Calibri" w:hAnsi="Calibri"/>
-                <w:sz w:val="28"/>
-              </w:rPr>
-              <w:t>agreement</w:t>
-            </w:r>
-            <w:r>
-              <w:rPr>
-                <w:rFonts w:ascii="Calibri" w:hAnsi="Calibri"/>
-                <w:sz w:val="28"/>
-              </w:rPr>
-              <w:br/>
-              <w:t>harmony</w:t>
-            </w:r>
-          </w:p>
-        </w:tc>
-        <w:tc>
-          <w:tcPr>
-            <w:tcW w:w="1564" w:type="dxa"/>
-            <w:tcBorders>
-              <w:top w:val="dotted" w:sz="4" w:space="0" w:color="auto"/>
-              <w:left w:val="nil"/>
-              <w:bottom w:val="dotted" w:sz="4" w:space="0" w:color="auto"/>
-            </w:tcBorders>
-            <w:vAlign w:val="center"/>
-          </w:tcPr>
-          <w:p>
-            <w:pPr>
-              <w:pStyle w:val="NoSpacing"/>
-              <w:bidi/>
-              <w:spacing w:line="276" w:lineRule="auto"/>
-              <w:rPr>
-                <w:rFonts w:eastAsiaTheme="minorHAnsi" w:cs="Calibri"/>
-                <w:color w:val="000000" w:themeColor="text1"/>
-                <w:sz w:val="26"/>
-                <w:szCs w:val="26"/>
-                <w:lang w:bidi="ar-DZ"/>
-              </w:rPr>
-            </w:pPr>
-            <w:proofErr w:type="spellStart"/>
-            <w:r>
-              <w:rPr>
-                <w:rFonts w:eastAsiaTheme="minorHAnsi" w:cs="Calibri"/>
-                <w:color w:val="000000" w:themeColor="text1"/>
-                <w:sz w:val="26"/>
-                <w:szCs w:val="26"/>
-                <w:lang w:bidi="ar-DZ"/>
-              </w:rPr>
-              <w:t>توافق</w:t>
-            </w:r>
-            <w:proofErr w:type="spellEnd"/>
-            <w:r>
-              <w:rPr>
-                <w:rFonts w:eastAsiaTheme="minorHAnsi" w:cs="Calibri"/>
-                <w:color w:val="000000" w:themeColor="text1"/>
-                <w:sz w:val="26"/>
-                <w:szCs w:val="26"/>
-                <w:lang w:bidi="ar-DZ"/>
-              </w:rPr>
-              <w:br/>
-            </w:r>
-            <w:proofErr w:type="spellStart"/>
-            <w:r>
-              <w:rPr>
-                <w:rFonts w:eastAsiaTheme="minorHAnsi" w:cs="Calibri"/>
-                <w:color w:val="000000" w:themeColor="text1"/>
-                <w:sz w:val="26"/>
-                <w:szCs w:val="26"/>
-                <w:lang w:bidi="ar-DZ"/>
-              </w:rPr>
-              <w:t>انسجام</w:t>
-            </w:r>
-            <w:proofErr w:type="spellEnd"/>
-          </w:p>
-        </w:tc>
-      </w:tr>
-      <w:tr>
-        <w:trPr>
-          <w:trHeight w:val="432"/>
-        </w:trPr>
-        <w:tc>
-          <w:tcPr>
-            <w:tcW w:w="2023" w:type="dxa"/>
-            <w:tcBorders>
-              <w:top w:val="dotted" w:sz="4" w:space="0" w:color="auto"/>
-              <w:bottom w:val="dotted" w:sz="4" w:space="0" w:color="auto"/>
-              <w:right w:val="nil"/>
-            </w:tcBorders>
-            <w:shd w:val="clear" w:color="auto" w:fill="FFFFCC"/>
-            <w:vAlign w:val="center"/>
-          </w:tcPr>
-          <w:p>
-            <w:pPr>
-              <w:rPr>
-                <w:rFonts w:ascii="Calibri" w:hAnsi="Calibri"/>
-                <w:sz w:val="28"/>
-              </w:rPr>
-            </w:pPr>
-            <w:r>
-              <w:rPr>
-                <w:rFonts w:ascii="Calibri" w:hAnsi="Calibri"/>
-                <w:sz w:val="28"/>
-              </w:rPr>
-              <w:t>respectful</w:t>
-            </w:r>
-          </w:p>
-        </w:tc>
-        <w:tc>
-          <w:tcPr>
-            <w:tcW w:w="1546" w:type="dxa"/>
-            <w:tcBorders>
-              <w:top w:val="dotted" w:sz="4" w:space="0" w:color="auto"/>
-              <w:left w:val="nil"/>
-              <w:bottom w:val="dotted" w:sz="4" w:space="0" w:color="auto"/>
-            </w:tcBorders>
-            <w:shd w:val="clear" w:color="auto" w:fill="FFFFCC"/>
-            <w:vAlign w:val="center"/>
-          </w:tcPr>
-          <w:p>
-            <w:pPr>
-              <w:pStyle w:val="NoSpacing"/>
-              <w:bidi/>
-              <w:spacing w:line="276" w:lineRule="auto"/>
-              <w:rPr>
-                <w:rFonts w:eastAsiaTheme="minorHAnsi" w:cs="Calibri"/>
-                <w:color w:val="000000" w:themeColor="text1"/>
-                <w:sz w:val="26"/>
-                <w:szCs w:val="26"/>
-                <w:lang w:bidi="ar-DZ"/>
-              </w:rPr>
-            </w:pPr>
-            <w:proofErr w:type="spellStart"/>
-            <w:r>
-              <w:rPr>
-                <w:rFonts w:eastAsiaTheme="minorHAnsi" w:cs="Calibri"/>
-                <w:color w:val="000000" w:themeColor="text1"/>
-                <w:sz w:val="26"/>
-                <w:szCs w:val="26"/>
-                <w:lang w:bidi="ar-DZ"/>
-              </w:rPr>
-              <w:t>محترم</w:t>
-            </w:r>
-            <w:proofErr w:type="spellEnd"/>
-            <w:r>
-              <w:rPr>
-                <w:rFonts w:eastAsiaTheme="minorHAnsi" w:cs="Calibri"/>
-                <w:color w:val="000000" w:themeColor="text1"/>
-                <w:sz w:val="26"/>
-                <w:szCs w:val="26"/>
-                <w:lang w:bidi="ar-DZ"/>
-              </w:rPr>
-              <w:t xml:space="preserve"> </w:t>
-            </w:r>
-            <w:proofErr w:type="spellStart"/>
-            <w:r>
-              <w:rPr>
-                <w:rFonts w:eastAsiaTheme="minorHAnsi" w:cs="Calibri"/>
-                <w:color w:val="000000" w:themeColor="text1"/>
-                <w:sz w:val="26"/>
-                <w:szCs w:val="26"/>
-                <w:lang w:bidi="ar-DZ"/>
-              </w:rPr>
-              <w:t>للآخرين</w:t>
-            </w:r>
-            <w:proofErr w:type="spellEnd"/>
-          </w:p>
-        </w:tc>
-        <w:tc>
-          <w:tcPr>
-            <w:tcW w:w="1783" w:type="dxa"/>
-            <w:tcBorders>
-              <w:top w:val="dotted" w:sz="4" w:space="0" w:color="auto"/>
-              <w:bottom w:val="dotted" w:sz="4" w:space="0" w:color="auto"/>
-              <w:right w:val="nil"/>
-            </w:tcBorders>
-            <w:shd w:val="clear" w:color="auto" w:fill="FFFFCC"/>
-            <w:vAlign w:val="center"/>
-          </w:tcPr>
-          <w:p>
-            <w:pPr>
-              <w:rPr>
-                <w:rFonts w:ascii="Calibri" w:hAnsi="Calibri"/>
-                <w:sz w:val="28"/>
-              </w:rPr>
-            </w:pPr>
-            <w:r>
-              <w:rPr>
-                <w:rFonts w:ascii="Calibri" w:hAnsi="Calibri"/>
-                <w:sz w:val="28"/>
-              </w:rPr>
-              <w:t>polite</w:t>
-            </w:r>
-          </w:p>
-        </w:tc>
-        <w:tc>
-          <w:tcPr>
-            <w:tcW w:w="1593" w:type="dxa"/>
-            <w:tcBorders>
-              <w:top w:val="dotted" w:sz="4" w:space="0" w:color="auto"/>
-              <w:left w:val="nil"/>
-              <w:bottom w:val="dotted" w:sz="4" w:space="0" w:color="auto"/>
-            </w:tcBorders>
-            <w:shd w:val="clear" w:color="auto" w:fill="FFFFCC"/>
-            <w:vAlign w:val="center"/>
-          </w:tcPr>
-          <w:p>
-            <w:pPr>
-              <w:pStyle w:val="NoSpacing"/>
-              <w:bidi/>
-              <w:spacing w:line="276" w:lineRule="auto"/>
-              <w:rPr>
-                <w:rFonts w:eastAsiaTheme="minorHAnsi" w:cs="Calibri"/>
-                <w:color w:val="000000" w:themeColor="text1"/>
-                <w:sz w:val="26"/>
-                <w:szCs w:val="26"/>
-                <w:lang w:bidi="ar-DZ"/>
-              </w:rPr>
-            </w:pPr>
-            <w:proofErr w:type="spellStart"/>
-            <w:r>
-              <w:rPr>
-                <w:rFonts w:eastAsiaTheme="minorHAnsi" w:cs="Calibri"/>
-                <w:color w:val="000000" w:themeColor="text1"/>
-                <w:sz w:val="26"/>
-                <w:szCs w:val="26"/>
-                <w:lang w:bidi="ar-DZ"/>
-              </w:rPr>
-              <w:t>مهذب</w:t>
-            </w:r>
-            <w:proofErr w:type="spellEnd"/>
-          </w:p>
-        </w:tc>
-        <w:tc>
-          <w:tcPr>
-            <w:tcW w:w="2057" w:type="dxa"/>
-            <w:tcBorders>
-              <w:top w:val="dotted" w:sz="4" w:space="0" w:color="auto"/>
-              <w:bottom w:val="dotted" w:sz="4" w:space="0" w:color="auto"/>
-              <w:right w:val="nil"/>
-            </w:tcBorders>
-            <w:shd w:val="clear" w:color="auto" w:fill="FFFFCC"/>
-            <w:vAlign w:val="center"/>
-          </w:tcPr>
-          <w:p>
-            <w:pPr>
-              <w:rPr>
-                <w:rFonts w:ascii="Calibri" w:hAnsi="Calibri"/>
-                <w:sz w:val="28"/>
-              </w:rPr>
-            </w:pPr>
-            <w:r>
-              <w:rPr>
-                <w:rFonts w:ascii="Calibri" w:hAnsi="Calibri"/>
-                <w:sz w:val="28"/>
-              </w:rPr>
-              <w:t>disrespectful</w:t>
-            </w:r>
-          </w:p>
-        </w:tc>
-        <w:tc>
-          <w:tcPr>
-            <w:tcW w:w="1564" w:type="dxa"/>
-            <w:tcBorders>
-              <w:top w:val="dotted" w:sz="4" w:space="0" w:color="auto"/>
-              <w:left w:val="nil"/>
-              <w:bottom w:val="dotted" w:sz="4" w:space="0" w:color="auto"/>
-            </w:tcBorders>
-            <w:shd w:val="clear" w:color="auto" w:fill="FFFFCC"/>
-            <w:vAlign w:val="center"/>
-          </w:tcPr>
-          <w:p>
-            <w:pPr>
-              <w:pStyle w:val="NoSpacing"/>
-              <w:bidi/>
-              <w:spacing w:line="276" w:lineRule="auto"/>
-              <w:rPr>
-                <w:rFonts w:eastAsiaTheme="minorHAnsi" w:cs="Calibri"/>
-                <w:color w:val="000000" w:themeColor="text1"/>
-                <w:sz w:val="26"/>
-                <w:szCs w:val="26"/>
-                <w:lang w:bidi="ar-DZ"/>
-              </w:rPr>
-            </w:pPr>
-            <w:proofErr w:type="spellStart"/>
-            <w:r>
-              <w:rPr>
-                <w:rFonts w:eastAsiaTheme="minorHAnsi" w:cs="Calibri"/>
-                <w:color w:val="000000" w:themeColor="text1"/>
-                <w:sz w:val="26"/>
-                <w:szCs w:val="26"/>
-                <w:lang w:bidi="ar-DZ"/>
-              </w:rPr>
-              <w:t>غير</w:t>
-            </w:r>
-            <w:proofErr w:type="spellEnd"/>
-            <w:r>
-              <w:rPr>
-                <w:rFonts w:eastAsiaTheme="minorHAnsi" w:cs="Calibri"/>
-                <w:color w:val="000000" w:themeColor="text1"/>
-                <w:sz w:val="26"/>
-                <w:szCs w:val="26"/>
-                <w:lang w:bidi="ar-DZ"/>
-              </w:rPr>
-              <w:t xml:space="preserve"> </w:t>
-            </w:r>
-            <w:proofErr w:type="spellStart"/>
-            <w:r>
-              <w:rPr>
-                <w:rFonts w:eastAsiaTheme="minorHAnsi" w:cs="Calibri"/>
-                <w:color w:val="000000" w:themeColor="text1"/>
-                <w:sz w:val="26"/>
-                <w:szCs w:val="26"/>
-                <w:lang w:bidi="ar-DZ"/>
-              </w:rPr>
-              <w:t>محترم</w:t>
-            </w:r>
-            <w:proofErr w:type="spellEnd"/>
-          </w:p>
-        </w:tc>
-      </w:tr>
-      <w:tr>
-        <w:trPr>
-          <w:trHeight w:val="432"/>
-        </w:trPr>
-        <w:tc>
-          <w:tcPr>
-            <w:tcW w:w="2023" w:type="dxa"/>
-            <w:tcBorders>
-              <w:top w:val="dotted" w:sz="4" w:space="0" w:color="auto"/>
-              <w:bottom w:val="dotted" w:sz="4" w:space="0" w:color="auto"/>
-              <w:right w:val="nil"/>
-            </w:tcBorders>
-            <w:vAlign w:val="center"/>
-          </w:tcPr>
-          <w:p>
-            <w:pPr>
-              <w:rPr>
-                <w:rFonts w:ascii="Calibri" w:hAnsi="Calibri"/>
-                <w:sz w:val="28"/>
-              </w:rPr>
-            </w:pPr>
-            <w:r>
-              <w:rPr>
-                <w:rFonts w:ascii="Calibri" w:hAnsi="Calibri"/>
-                <w:sz w:val="28"/>
-              </w:rPr>
-              <w:t>upset</w:t>
-            </w:r>
-          </w:p>
-        </w:tc>
-        <w:tc>
-          <w:tcPr>
-            <w:tcW w:w="1546" w:type="dxa"/>
-            <w:tcBorders>
-              <w:top w:val="dotted" w:sz="4" w:space="0" w:color="auto"/>
-              <w:left w:val="nil"/>
-              <w:bottom w:val="dotted" w:sz="4" w:space="0" w:color="auto"/>
-            </w:tcBorders>
-            <w:vAlign w:val="center"/>
-          </w:tcPr>
-          <w:p>
-            <w:pPr>
-              <w:pStyle w:val="NoSpacing"/>
-              <w:bidi/>
-              <w:spacing w:line="276" w:lineRule="auto"/>
-              <w:rPr>
-                <w:rFonts w:eastAsiaTheme="minorHAnsi" w:cs="Calibri"/>
-                <w:color w:val="000000" w:themeColor="text1"/>
-                <w:sz w:val="26"/>
-                <w:szCs w:val="26"/>
-                <w:lang w:bidi="ar-DZ"/>
-              </w:rPr>
-            </w:pPr>
-            <w:proofErr w:type="spellStart"/>
-            <w:r>
-              <w:rPr>
-                <w:rFonts w:eastAsiaTheme="minorHAnsi" w:cs="Calibri"/>
-                <w:color w:val="000000" w:themeColor="text1"/>
-                <w:sz w:val="26"/>
-                <w:szCs w:val="26"/>
-                <w:lang w:bidi="ar-DZ"/>
-              </w:rPr>
-              <w:t>قلق</w:t>
-            </w:r>
-            <w:proofErr w:type="spellEnd"/>
-            <w:r>
-              <w:rPr>
-                <w:rFonts w:eastAsiaTheme="minorHAnsi" w:cs="Calibri"/>
-                <w:color w:val="000000" w:themeColor="text1"/>
-                <w:sz w:val="26"/>
-                <w:szCs w:val="26"/>
-                <w:lang w:bidi="ar-DZ"/>
-              </w:rPr>
-              <w:br/>
-            </w:r>
-            <w:proofErr w:type="spellStart"/>
-            <w:r>
-              <w:rPr>
-                <w:rFonts w:eastAsiaTheme="minorHAnsi" w:cs="Calibri"/>
-                <w:color w:val="000000" w:themeColor="text1"/>
-                <w:sz w:val="26"/>
-                <w:szCs w:val="26"/>
-                <w:lang w:bidi="ar-DZ"/>
-              </w:rPr>
-              <w:t>منزعج</w:t>
-            </w:r>
-            <w:proofErr w:type="spellEnd"/>
-          </w:p>
-        </w:tc>
-        <w:tc>
-          <w:tcPr>
-            <w:tcW w:w="1783" w:type="dxa"/>
-            <w:tcBorders>
-              <w:top w:val="dotted" w:sz="4" w:space="0" w:color="auto"/>
-              <w:bottom w:val="dotted" w:sz="4" w:space="0" w:color="auto"/>
-              <w:right w:val="nil"/>
-            </w:tcBorders>
-            <w:vAlign w:val="center"/>
-          </w:tcPr>
-          <w:p>
-            <w:pPr>
-              <w:rPr>
-                <w:rFonts w:ascii="Calibri" w:hAnsi="Calibri"/>
-                <w:sz w:val="28"/>
-              </w:rPr>
-            </w:pPr>
-            <w:r>
-              <w:rPr>
-                <w:rFonts w:ascii="Calibri" w:hAnsi="Calibri"/>
-                <w:sz w:val="28"/>
-              </w:rPr>
-              <w:t>worried</w:t>
-            </w:r>
-            <w:r>
-              <w:rPr>
-                <w:rFonts w:ascii="Calibri" w:hAnsi="Calibri"/>
-                <w:sz w:val="28"/>
-              </w:rPr>
-              <w:br/>
-              <w:t>disturbed</w:t>
-            </w:r>
-          </w:p>
-        </w:tc>
-        <w:tc>
-          <w:tcPr>
-            <w:tcW w:w="1593" w:type="dxa"/>
-            <w:tcBorders>
-              <w:top w:val="dotted" w:sz="4" w:space="0" w:color="auto"/>
-              <w:left w:val="nil"/>
-              <w:bottom w:val="dotted" w:sz="4" w:space="0" w:color="auto"/>
-            </w:tcBorders>
-            <w:vAlign w:val="center"/>
-          </w:tcPr>
-          <w:p>
-            <w:pPr>
-              <w:pStyle w:val="NoSpacing"/>
-              <w:bidi/>
-              <w:spacing w:line="276" w:lineRule="auto"/>
-              <w:rPr>
-                <w:rFonts w:eastAsiaTheme="minorHAnsi" w:cs="Calibri"/>
-                <w:color w:val="000000" w:themeColor="text1"/>
-                <w:sz w:val="26"/>
-                <w:szCs w:val="26"/>
-                <w:lang w:bidi="ar-DZ"/>
-              </w:rPr>
-            </w:pPr>
-            <w:proofErr w:type="spellStart"/>
-            <w:r>
-              <w:rPr>
-                <w:rFonts w:eastAsiaTheme="minorHAnsi" w:cs="Calibri"/>
-                <w:color w:val="000000" w:themeColor="text1"/>
-                <w:sz w:val="26"/>
-                <w:szCs w:val="26"/>
-                <w:lang w:bidi="ar-DZ"/>
-              </w:rPr>
-              <w:t>قلق</w:t>
-            </w:r>
-            <w:proofErr w:type="spellEnd"/>
-            <w:r>
-              <w:rPr>
-                <w:rFonts w:eastAsiaTheme="minorHAnsi" w:cs="Calibri"/>
-                <w:color w:val="000000" w:themeColor="text1"/>
-                <w:sz w:val="26"/>
-                <w:szCs w:val="26"/>
-                <w:lang w:bidi="ar-DZ"/>
-              </w:rPr>
-              <w:br/>
-            </w:r>
-            <w:proofErr w:type="spellStart"/>
-            <w:r>
-              <w:rPr>
-                <w:rFonts w:eastAsiaTheme="minorHAnsi" w:cs="Calibri"/>
-                <w:color w:val="000000" w:themeColor="text1"/>
-                <w:sz w:val="26"/>
-                <w:szCs w:val="26"/>
-                <w:lang w:bidi="ar-DZ"/>
-              </w:rPr>
-              <w:t>مضطرب</w:t>
-            </w:r>
-            <w:proofErr w:type="spellEnd"/>
-          </w:p>
-        </w:tc>
-        <w:tc>
-          <w:tcPr>
-            <w:tcW w:w="2057" w:type="dxa"/>
-            <w:tcBorders>
-              <w:top w:val="dotted" w:sz="4" w:space="0" w:color="auto"/>
-              <w:bottom w:val="dotted" w:sz="4" w:space="0" w:color="auto"/>
-              <w:right w:val="nil"/>
-            </w:tcBorders>
-            <w:vAlign w:val="center"/>
-          </w:tcPr>
-          <w:p>
-            <w:pPr>
-              <w:rPr>
-                <w:rFonts w:ascii="Calibri" w:hAnsi="Calibri"/>
-                <w:sz w:val="28"/>
-              </w:rPr>
-            </w:pPr>
-            <w:r>
-              <w:rPr>
-                <w:rFonts w:ascii="Calibri" w:hAnsi="Calibri"/>
-                <w:sz w:val="28"/>
-              </w:rPr>
-              <w:t>relaxed</w:t>
-            </w:r>
-            <w:r>
-              <w:rPr>
-                <w:rFonts w:ascii="Calibri" w:hAnsi="Calibri"/>
-                <w:sz w:val="28"/>
-              </w:rPr>
-              <w:br/>
-              <w:t>happy</w:t>
-            </w:r>
-          </w:p>
-        </w:tc>
-        <w:tc>
-          <w:tcPr>
-            <w:tcW w:w="1564" w:type="dxa"/>
-            <w:tcBorders>
-              <w:top w:val="dotted" w:sz="4" w:space="0" w:color="auto"/>
-              <w:left w:val="nil"/>
-              <w:bottom w:val="dotted" w:sz="4" w:space="0" w:color="auto"/>
-            </w:tcBorders>
-            <w:vAlign w:val="center"/>
-          </w:tcPr>
-          <w:p>
-            <w:pPr>
-              <w:pStyle w:val="NoSpacing"/>
-              <w:bidi/>
-              <w:spacing w:line="276" w:lineRule="auto"/>
-              <w:rPr>
-                <w:rFonts w:eastAsiaTheme="minorHAnsi" w:cs="Calibri"/>
-                <w:color w:val="000000" w:themeColor="text1"/>
-                <w:sz w:val="26"/>
-                <w:szCs w:val="26"/>
-                <w:lang w:bidi="ar-DZ"/>
-              </w:rPr>
-            </w:pPr>
-            <w:proofErr w:type="spellStart"/>
-            <w:r>
-              <w:rPr>
-                <w:rFonts w:eastAsiaTheme="minorHAnsi" w:cs="Calibri"/>
-                <w:color w:val="000000" w:themeColor="text1"/>
-                <w:sz w:val="26"/>
-                <w:szCs w:val="26"/>
-                <w:lang w:bidi="ar-DZ"/>
-              </w:rPr>
-              <w:t>مسترخي</w:t>
-            </w:r>
-            <w:proofErr w:type="spellEnd"/>
-            <w:r>
-              <w:rPr>
-                <w:rFonts w:eastAsiaTheme="minorHAnsi" w:cs="Calibri"/>
-                <w:color w:val="000000" w:themeColor="text1"/>
-                <w:sz w:val="26"/>
-                <w:szCs w:val="26"/>
-                <w:lang w:bidi="ar-DZ"/>
-              </w:rPr>
-              <w:br/>
-            </w:r>
-            <w:proofErr w:type="spellStart"/>
-            <w:r>
-              <w:rPr>
-                <w:rFonts w:eastAsiaTheme="minorHAnsi" w:cs="Calibri"/>
-                <w:color w:val="000000" w:themeColor="text1"/>
-                <w:sz w:val="26"/>
-                <w:szCs w:val="26"/>
-                <w:lang w:bidi="ar-DZ"/>
-              </w:rPr>
-              <w:t>سعيد</w:t>
-            </w:r>
-            <w:proofErr w:type="spellEnd"/>
-          </w:p>
-        </w:tc>
-      </w:tr>
+      <w:bookmarkEnd w:id="0"/>
     </w:tbl>
     <w:p>
       <w:pPr>
@@ -5958,7 +3210,6 @@
         </w:rPr>
       </w:pPr>
     </w:p>
-    <w:bookmarkEnd w:id="0"/>
     <w:sectPr>
       <w:headerReference w:type="even" r:id="rId8"/>
       <w:headerReference w:type="default" r:id="rId9"/>
@@ -5967,7 +3218,6 @@
       <w:pgMar w:top="1260" w:right="747" w:bottom="900" w:left="810" w:header="426" w:footer="643" w:gutter="0"/>
       <w:pgNumType w:start="34"/>
       <w:cols w:space="720"/>
-      <w:titlePg/>
       <w:docGrid w:linePitch="360"/>
     </w:sectPr>
   </w:body>
@@ -6222,7 +3472,7 @@
         </mc:Choice>
         <mc:Fallback>
           <w:pict>
-            <v:group w14:anchorId="4B592B21" id="Group 215" o:spid="_x0000_s1026" style="position:absolute;margin-left:-22.7pt;margin-top:-.1pt;width:562.95pt;height:36.35pt;z-index:251658240;mso-width-relative:margin;mso-height-relative:margin" coordorigin="-231,79" coordsize="71497,4620" o:gfxdata="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">
+            <v:group w14:anchorId="4B66639D" id="Group 215" o:spid="_x0000_s1026" style="position:absolute;margin-left:-22.7pt;margin-top:-.1pt;width:562.95pt;height:36.35pt;z-index:251658240;mso-width-relative:margin;mso-height-relative:margin" coordorigin="-231,79" coordsize="71497,4620" o:gfxdata="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">
               <v:group id="Group 206" o:spid="_x0000_s1027" style="position:absolute;left:-231;top:79;width:71497;height:4577" coordorigin="-231,79" coordsize="71497,4576" o:gfxdata="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">
                 <v:group id="Group 179" o:spid="_x0000_s1028" style="position:absolute;left:-231;top:79;width:71497;height:4074" coordorigin="-538,88" coordsize="71516,4090" o:gfxdata="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">
                   <v:shapetype id="_x0000_t75" coordsize="21600,21600" o:spt="75" o:preferrelative="t" path="m@4@5l@4@11@9@11@9@5xe" filled="f" stroked="f">
@@ -7047,7 +4297,7 @@
         </mc:Choice>
         <mc:Fallback>
           <w:pict>
-            <v:group w14:anchorId="4338BD6D" id="Group 2" o:spid="_x0000_s1026" style="position:absolute;margin-left:-23.05pt;margin-top:.2pt;width:563.5pt;height:39.05pt;z-index:251659264;mso-height-relative:margin" coordorigin=",-127" coordsize="71564,4959" o:gfxdata="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">
+            <v:group w14:anchorId="0667054F" id="Group 2" o:spid="_x0000_s1026" style="position:absolute;margin-left:-23.05pt;margin-top:.2pt;width:563.5pt;height:39.05pt;z-index:251659264;mso-height-relative:margin" coordorigin=",-127" coordsize="71564,4959" o:gfxdata="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">
               <v:group id="Group 9" o:spid="_x0000_s1027" style="position:absolute;width:71564;height:4832" coordorigin=",444" coordsize="71564,4832" o:gfxdata="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">
                 <v:group id="Group 124" o:spid="_x0000_s1028" style="position:absolute;top:444;width:71564;height:4832" coordsize="71564,4836" o:gfxdata="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">
                   <v:group id="Group 92261" o:spid="_x0000_s1029" style="position:absolute;top:570;width:71564;height:4266" coordorigin=",-1" coordsize="71455,5126" o:gfxdata="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">
@@ -11263,7 +8513,7 @@
   </w:docDefaults>
   <w:latentStyles w:defLockedState="0" w:defUIPriority="99" w:defSemiHidden="0" w:defUnhideWhenUsed="0" w:defQFormat="0" w:count="376">
     <w:lsdException w:name="Normal" w:uiPriority="0" w:qFormat="1"/>
-    <w:lsdException w:name="heading 1" w:uiPriority="9" w:qFormat="1"/>
+    <w:lsdException w:name="heading 1" w:uiPriority="0" w:qFormat="1"/>
     <w:lsdException w:name="heading 2" w:semiHidden="1" w:uiPriority="9" w:unhideWhenUsed="1" w:qFormat="1"/>
     <w:lsdException w:name="heading 3" w:semiHidden="1" w:uiPriority="0" w:unhideWhenUsed="1" w:qFormat="1"/>
     <w:lsdException w:name="heading 4" w:semiHidden="1" w:uiPriority="0" w:unhideWhenUsed="1" w:qFormat="1"/>
@@ -11652,7 +8902,6 @@
     <w:basedOn w:val="Normal"/>
     <w:next w:val="Normal"/>
     <w:link w:val="Heading1Char"/>
-    <w:uiPriority w:val="9"/>
     <w:qFormat/>
     <w:rsid w:val="00DC361E"/>
     <w:pPr>
@@ -12174,7 +9423,6 @@
     <w:name w:val="Heading 1 Char"/>
     <w:basedOn w:val="DefaultParagraphFont"/>
     <w:link w:val="Heading1"/>
-    <w:uiPriority w:val="9"/>
     <w:qFormat/>
     <w:rsid w:val="00DC361E"/>
     <w:rPr>

</xml_diff>